<commit_message>
circuit change, _error handling, timeout add
</commit_message>
<xml_diff>
--- a/raspberry_pi/s_w/slotguard/docs/ATmega128A_UART_구현명세_v1.0.docx
+++ b/raspberry_pi/s_w/slotguard/docs/ATmega128A_UART_구현명세_v1.0.docx
@@ -39,7 +39,7 @@
           <w:rFonts w:ascii="Noto Sans CJK KR" w:hAnsi="Noto Sans CJK KR" w:eastAsia="Noto Sans CJK KR"/>
           <w:b w:val="0"/>
         </w:rPr>
-        <w:t>문서 버전: v1.1 작성 기준일: 2026-08-24 대상: ATmega128A 펌웨어 개발팀 연동 상대: Raspberry Pi 4 / SLOT-GUARD Flask·UART 서비스</w:t>
+        <w:t>문서 버전: v1.3 작성 기준일: 2026-08-24 대상: ATmega128A 펌웨어 개발팀 연동 상대: Raspberry Pi 4 / SLOT-GUARD Flask·UART 서비스</w:t>
       </w:r>
     </w:p>
     <w:p>
@@ -85,6 +85,48 @@
           <w:b w:val="0"/>
         </w:rPr>
         <w:t>DISPENSE: 사용자가 LCD 버튼을 누른 뒤 서보모터로 한 슬롯의 한 정을 배출</w:t>
+      </w:r>
+    </w:p>
+    <w:p>
+      <w:pPr>
+        <w:pStyle w:val="ListNumber"/>
+      </w:pPr>
+      <w:r>
+        <w:rPr>
+          <w:rFonts w:ascii="Noto Sans CJK KR" w:hAnsi="Noto Sans CJK KR" w:eastAsia="Noto Sans CJK KR"/>
+          <w:b w:val="0"/>
+        </w:rPr>
+        <w:t xml:space="preserve">마지막 슬롯 </w:t>
+      </w:r>
+      <w:r>
+        <w:rPr>
+          <w:rFonts w:ascii="D2Coding" w:hAnsi="D2Coding" w:eastAsia="D2Coding"/>
+          <w:color w:val="9A3412"/>
+          <w:sz w:val="18"/>
+        </w:rPr>
+        <w:t>(1,0)</w:t>
+      </w:r>
+      <w:r>
+        <w:rPr>
+          <w:rFonts w:ascii="Noto Sans CJK KR" w:hAnsi="Noto Sans CJK KR" w:eastAsia="Noto Sans CJK KR"/>
+          <w:b w:val="0"/>
+        </w:rPr>
+        <w:t xml:space="preserve"> 성공 후 결과 ACK를 받으면 </w:t>
+      </w:r>
+      <w:r>
+        <w:rPr>
+          <w:rFonts w:ascii="D2Coding" w:hAnsi="D2Coding" w:eastAsia="D2Coding"/>
+          <w:color w:val="9A3412"/>
+          <w:sz w:val="18"/>
+        </w:rPr>
+        <w:t>(0,0)</w:t>
+      </w:r>
+      <w:r>
+        <w:rPr>
+          <w:rFonts w:ascii="Noto Sans CJK KR" w:hAnsi="Noto Sans CJK KR" w:eastAsia="Noto Sans CJK KR"/>
+          <w:b w:val="0"/>
+        </w:rPr>
+        <w:t>으로 자동 복귀</w:t>
       </w:r>
     </w:p>
     <w:p>
@@ -854,7 +896,7 @@
           <w:rFonts w:ascii="Noto Sans CJK KR" w:hAnsi="Noto Sans CJK KR" w:eastAsia="Noto Sans CJK KR"/>
           <w:b w:val="0"/>
         </w:rPr>
-        <w:t>ACK가 없을 때 Pi는 10초마다 같은 요청번호와 같은 전체 페이로드를 재전송한다.</w:t>
+        <w:t>TIMEOUT의 번호는 신규 요청번호가 아니라 종료할 MOVE 요청번호를 참조한다.</w:t>
       </w:r>
     </w:p>
     <w:p>
@@ -866,7 +908,7 @@
           <w:rFonts w:ascii="Noto Sans CJK KR" w:hAnsi="Noto Sans CJK KR" w:eastAsia="Noto Sans CJK KR"/>
           <w:b w:val="0"/>
         </w:rPr>
-        <w:t>ATmega는 요청번호만 비교하지 않고 명령 종류와 전체 페이로드 일치도 확인한다.</w:t>
+        <w:t>ACK가 없을 때 Pi는 10초마다 같은 요청번호와 같은 전체 페이로드를 재전송한다.</w:t>
       </w:r>
     </w:p>
     <w:p>
@@ -878,7 +920,19 @@
           <w:rFonts w:ascii="Noto Sans CJK KR" w:hAnsi="Noto Sans CJK KR" w:eastAsia="Noto Sans CJK KR"/>
           <w:b w:val="0"/>
         </w:rPr>
-        <w:t xml:space="preserve">같은 요청번호에 다른 명령 또는 좌표가 오면 동작하지 않고 </w:t>
+        <w:t>ATmega는 요청번호만 비교하지 않고 명령 종류와 전체 페이로드 일치도 확인한다.</w:t>
+      </w:r>
+    </w:p>
+    <w:p>
+      <w:pPr>
+        <w:pStyle w:val="ListBullet"/>
+      </w:pPr>
+      <w:r>
+        <w:rPr>
+          <w:rFonts w:ascii="Noto Sans CJK KR" w:hAnsi="Noto Sans CJK KR" w:eastAsia="Noto Sans CJK KR"/>
+          <w:b w:val="0"/>
+        </w:rPr>
+        <w:t xml:space="preserve">TIMEOUT 참조를 제외하고, 같은 요청번호에 다른 명령 또는 좌표가 오면 동작하지 않고 </w:t>
       </w:r>
       <w:r>
         <w:rPr>
@@ -1498,7 +1552,175 @@
           <w:rFonts w:ascii="Noto Sans CJK KR" w:hAnsi="Noto Sans CJK KR" w:eastAsia="Noto Sans CJK KR"/>
           <w:b w:val="0"/>
         </w:rPr>
-        <w:t>4.3 RESULT의 XYR</w:t>
+        <w:t>4.3 TIMEOUT</w:t>
+      </w:r>
+    </w:p>
+    <w:p>
+      <w:pPr>
+        <w:spacing w:before="60" w:after="140"/>
+        <w:ind w:left="198" w:right="198"/>
+        <w:shd w:fill="F1F5F9"/>
+      </w:pPr>
+      <w:r>
+        <w:rPr>
+          <w:rFonts w:ascii="D2Coding" w:hAnsi="D2Coding" w:eastAsia="D2Coding"/>
+          <w:color w:val="0F172A"/>
+          <w:sz w:val="17"/>
+        </w:rPr>
+        <w:t>TIMEOUT|RRRRRRRR\n</w:t>
+      </w:r>
+    </w:p>
+    <w:p>
+      <w:r>
+        <w:rPr>
+          <w:rFonts w:ascii="D2Coding" w:hAnsi="D2Coding" w:eastAsia="D2Coding"/>
+          <w:color w:val="9A3412"/>
+          <w:sz w:val="18"/>
+        </w:rPr>
+        <w:t>RRRRRRRR</w:t>
+      </w:r>
+      <w:r>
+        <w:rPr>
+          <w:rFonts w:ascii="Noto Sans CJK KR" w:hAnsi="Noto Sans CJK KR" w:eastAsia="Noto Sans CJK KR"/>
+          <w:b w:val="0"/>
+        </w:rPr>
+        <w:t xml:space="preserve">은 새 요청번호가 아니라 현재 </w:t>
+      </w:r>
+      <w:r>
+        <w:rPr>
+          <w:rFonts w:ascii="D2Coding" w:hAnsi="D2Coding" w:eastAsia="D2Coding"/>
+          <w:color w:val="9A3412"/>
+          <w:sz w:val="18"/>
+        </w:rPr>
+        <w:t>READY</w:t>
+      </w:r>
+      <w:r>
+        <w:rPr>
+          <w:rFonts w:ascii="Noto Sans CJK KR" w:hAnsi="Noto Sans CJK KR" w:eastAsia="Noto Sans CJK KR"/>
+          <w:b w:val="0"/>
+        </w:rPr>
+        <w:t xml:space="preserve"> 상태를 만든 MOVE 요청번호다. Pi는 복약 허용시간이 끝났지만 DISPENSE가 시작되지 않은 경우 다음 순서로 TIMEOUT을 보낸다.</w:t>
+      </w:r>
+    </w:p>
+    <w:p>
+      <w:pPr>
+        <w:spacing w:before="60" w:after="140"/>
+        <w:ind w:left="198" w:right="198"/>
+        <w:shd w:fill="F1F5F9"/>
+      </w:pPr>
+      <w:r>
+        <w:rPr>
+          <w:rFonts w:ascii="D2Coding" w:hAnsi="D2Coding" w:eastAsia="D2Coding"/>
+          <w:color w:val="0F172A"/>
+          <w:sz w:val="17"/>
+        </w:rPr>
+        <w:t>Pi → AT: TIMEOUT|00000001</w:t>
+      </w:r>
+      <w:r>
+        <w:br/>
+      </w:r>
+      <w:r>
+        <w:rPr>
+          <w:rFonts w:ascii="D2Coding" w:hAnsi="D2Coding" w:eastAsia="D2Coding"/>
+          <w:color w:val="0F172A"/>
+          <w:sz w:val="17"/>
+        </w:rPr>
+        <w:t>AT: READY 해제, 좌표 유지, 다음 MOVE 허용 상태 저장</w:t>
+      </w:r>
+      <w:r>
+        <w:br/>
+      </w:r>
+      <w:r>
+        <w:rPr>
+          <w:rFonts w:ascii="D2Coding" w:hAnsi="D2Coding" w:eastAsia="D2Coding"/>
+          <w:color w:val="0F172A"/>
+          <w:sz w:val="17"/>
+        </w:rPr>
+        <w:t>AT → Pi: ACK|00000001|TIMEOUT</w:t>
+      </w:r>
+    </w:p>
+    <w:p>
+      <w:pPr>
+        <w:pStyle w:val="ListBullet"/>
+      </w:pPr>
+      <w:r>
+        <w:rPr>
+          <w:rFonts w:ascii="Noto Sans CJK KR" w:hAnsi="Noto Sans CJK KR" w:eastAsia="Noto Sans CJK KR"/>
+          <w:b w:val="0"/>
+        </w:rPr>
+        <w:t>ATmega는 MOVE 요청번호가 현재 READY와 일치할 때만 READY를 해제한다.</w:t>
+      </w:r>
+    </w:p>
+    <w:p>
+      <w:pPr>
+        <w:pStyle w:val="ListBullet"/>
+      </w:pPr>
+      <w:r>
+        <w:rPr>
+          <w:rFonts w:ascii="Noto Sans CJK KR" w:hAnsi="Noto Sans CJK KR" w:eastAsia="Noto Sans CJK KR"/>
+          <w:b w:val="0"/>
+        </w:rPr>
+        <w:t>스테핑모터와 서보모터를 새로 구동하지 않으며 현재 좌표는 유지한다.</w:t>
+      </w:r>
+    </w:p>
+    <w:p>
+      <w:pPr>
+        <w:pStyle w:val="ListBullet"/>
+      </w:pPr>
+      <w:r>
+        <w:rPr>
+          <w:rFonts w:ascii="Noto Sans CJK KR" w:hAnsi="Noto Sans CJK KR" w:eastAsia="Noto Sans CJK KR"/>
+          <w:b w:val="0"/>
+        </w:rPr>
+        <w:t>TIMEOUT 처리 상태를 EEPROM에 먼저 저장한 뒤 ACK한다.</w:t>
+      </w:r>
+    </w:p>
+    <w:p>
+      <w:pPr>
+        <w:pStyle w:val="ListBullet"/>
+      </w:pPr>
+      <w:r>
+        <w:rPr>
+          <w:rFonts w:ascii="Noto Sans CJK KR" w:hAnsi="Noto Sans CJK KR" w:eastAsia="Noto Sans CJK KR"/>
+          <w:b w:val="0"/>
+        </w:rPr>
+        <w:t>같은 TIMEOUT을 다시 받으면 상태를 다시 바꾸지 않고 같은 ACK만 재전송한다.</w:t>
+      </w:r>
+    </w:p>
+    <w:p>
+      <w:pPr>
+        <w:pStyle w:val="ListBullet"/>
+      </w:pPr>
+      <w:r>
+        <w:rPr>
+          <w:rFonts w:ascii="Noto Sans CJK KR" w:hAnsi="Noto Sans CJK KR" w:eastAsia="Noto Sans CJK KR"/>
+          <w:b w:val="0"/>
+        </w:rPr>
+        <w:t>TIMEOUT ACK 후에는 새 요청번호의 MOVE를 받아야 한다.</w:t>
+      </w:r>
+    </w:p>
+    <w:p>
+      <w:pPr>
+        <w:pStyle w:val="ListBullet"/>
+      </w:pPr>
+      <w:r>
+        <w:rPr>
+          <w:rFonts w:ascii="Noto Sans CJK KR" w:hAnsi="Noto Sans CJK KR" w:eastAsia="Noto Sans CJK KR"/>
+          <w:b w:val="0"/>
+        </w:rPr>
+        <w:t>MOVING, DISPENSING, RESULT_READY에는 Pi가 TIMEOUT을 보내지 않는다.</w:t>
+      </w:r>
+    </w:p>
+    <w:p>
+      <w:pPr>
+        <w:pStyle w:val="Heading3"/>
+      </w:pPr>
+      <w:r>
+        <w:rPr>
+          <w:rFonts w:ascii="Noto Sans CJK KR" w:hAnsi="Noto Sans CJK KR" w:eastAsia="Noto Sans CJK KR"/>
+          <w:b w:val="0"/>
+        </w:rPr>
+        <w:t>4.4 RESULT의 XYR</w:t>
       </w:r>
     </w:p>
     <w:p>
@@ -1969,7 +2191,7 @@
           <w:rFonts w:ascii="Noto Sans CJK KR" w:hAnsi="Noto Sans CJK KR" w:eastAsia="Noto Sans CJK KR"/>
           <w:b w:val="0"/>
         </w:rPr>
-        <w:t>4.4 ERROR</w:t>
+        <w:t>4.5 ERROR</w:t>
       </w:r>
     </w:p>
     <w:p>
@@ -1984,7 +2206,42 @@
           <w:color w:val="0F172A"/>
           <w:sz w:val="17"/>
         </w:rPr>
+        <w:t>ERROR|INVALID_FORMAT\n</w:t>
+      </w:r>
+      <w:r>
+        <w:br/>
+      </w:r>
+      <w:r>
+        <w:rPr>
+          <w:rFonts w:ascii="D2Coding" w:hAnsi="D2Coding" w:eastAsia="D2Coding"/>
+          <w:color w:val="0F172A"/>
+          <w:sz w:val="17"/>
+        </w:rPr>
         <w:t>ERROR|RRRRRRRR|ERROR_CODE\n</w:t>
+      </w:r>
+    </w:p>
+    <w:p>
+      <w:r>
+        <w:rPr>
+          <w:rFonts w:ascii="Noto Sans CJK KR" w:hAnsi="Noto Sans CJK KR" w:eastAsia="Noto Sans CJK KR"/>
+          <w:b w:val="0"/>
+        </w:rPr>
+        <w:t xml:space="preserve">Pi에서 받은 프레임의 형식이 잘못된 경우에는 요청번호를 복구하거나 임의로 채우지 않고 </w:t>
+      </w:r>
+      <w:r>
+        <w:rPr>
+          <w:rFonts w:ascii="D2Coding" w:hAnsi="D2Coding" w:eastAsia="D2Coding"/>
+          <w:color w:val="9A3412"/>
+          <w:sz w:val="18"/>
+        </w:rPr>
+        <w:t>ERROR|INVALID_FORMAT</w:t>
+      </w:r>
+      <w:r>
+        <w:rPr>
+          <w:rFonts w:ascii="Noto Sans CJK KR" w:hAnsi="Noto Sans CJK KR" w:eastAsia="Noto Sans CJK KR"/>
+          <w:b w:val="0"/>
+        </w:rPr>
+        <w:t>만 보낸다. 그 밖의 장치 오류는 정상적으로 수신한 요청의 8자리 요청번호를 포함한다.</w:t>
       </w:r>
     </w:p>
     <w:p>
@@ -2301,7 +2558,7 @@
                 <w:b w:val="0"/>
                 <w:sz w:val="17"/>
               </w:rPr>
-              <w:t>MOVE WAIT 이전 DISPENSE 수신</w:t>
+              <w:t>MOVE WAIT 이전 DISPENSE 또는 READY/TIMED_OUT가 아닌 TIMEOUT 수신</w:t>
             </w:r>
           </w:p>
         </w:tc>
@@ -2562,6 +2819,52 @@
       </w:r>
     </w:p>
     <w:p>
+      <w:r>
+        <w:rPr>
+          <w:rFonts w:ascii="D2Coding" w:hAnsi="D2Coding" w:eastAsia="D2Coding"/>
+          <w:color w:val="9A3412"/>
+          <w:sz w:val="18"/>
+        </w:rPr>
+        <w:t>INVALID_FORMAT</w:t>
+      </w:r>
+      <w:r>
+        <w:rPr>
+          <w:rFonts w:ascii="Noto Sans CJK KR" w:hAnsi="Noto Sans CJK KR" w:eastAsia="Noto Sans CJK KR"/>
+          <w:b w:val="0"/>
+        </w:rPr>
+        <w:t xml:space="preserve">은 일정 실패 보고가 아니라 </w:t>
+      </w:r>
+      <w:r>
+        <w:rPr>
+          <w:rFonts w:ascii="Noto Sans CJK KR" w:hAnsi="Noto Sans CJK KR" w:eastAsia="Noto Sans CJK KR"/>
+          <w:b/>
+        </w:rPr>
+        <w:t>Pi가 마지막으로 송신한 프레임의 즉시 재전송 요청</w:t>
+      </w:r>
+      <w:r>
+        <w:rPr>
+          <w:rFonts w:ascii="Noto Sans CJK KR" w:hAnsi="Noto Sans CJK KR" w:eastAsia="Noto Sans CJK KR"/>
+          <w:b w:val="0"/>
+        </w:rPr>
+        <w:t xml:space="preserve">이다. ATmega는 항상 요청번호 없는 </w:t>
+      </w:r>
+      <w:r>
+        <w:rPr>
+          <w:rFonts w:ascii="D2Coding" w:hAnsi="D2Coding" w:eastAsia="D2Coding"/>
+          <w:color w:val="9A3412"/>
+          <w:sz w:val="18"/>
+        </w:rPr>
+        <w:t>ERROR|INVALID_FORMAT</w:t>
+      </w:r>
+      <w:r>
+        <w:rPr>
+          <w:rFonts w:ascii="Noto Sans CJK KR" w:hAnsi="Noto Sans CJK KR" w:eastAsia="Noto Sans CJK KR"/>
+          <w:b w:val="0"/>
+        </w:rPr>
+        <w:t>을 보내고, Pi는 마지막으로 송신에 성공한 MOVE, DISPENSE, TIMEOUT 또는 RESULT ACK 전체를 그대로 다시 보낸다. 다른 ERROR 코드는 기존처럼 요청번호를 포함하며 현재 일정을 통신 오류로 종료할 수 있다.</w:t>
+      </w:r>
+    </w:p>
+    <w:p>
       <w:pPr>
         <w:pStyle w:val="Heading2"/>
       </w:pPr>
@@ -2607,7 +2910,7 @@
           <w:color w:val="0F172A"/>
           <w:sz w:val="17"/>
         </w:rPr>
-        <w:t xml:space="preserve">      └─ 새 DISPENSE → DISPENSE_ACCEPTED → DISPENSING → RESULT_READY</w:t>
+        <w:t xml:space="preserve">      ├─ TIMEOUT → TIMED_OUT</w:t>
       </w:r>
       <w:r>
         <w:br/>
@@ -2618,7 +2921,7 @@
           <w:color w:val="0F172A"/>
           <w:sz w:val="17"/>
         </w:rPr>
-        <w:t xml:space="preserve">           └─ RESULT ACK → RESULT_ACKED</w:t>
+        <w:t xml:space="preserve">      └─ 새 DISPENSE → DISPENSE_ACCEPTED → DISPENSING → RESULT_READY</w:t>
       </w:r>
       <w:r>
         <w:br/>
@@ -2629,6 +2932,7 @@
           <w:color w:val="0F172A"/>
           <w:sz w:val="17"/>
         </w:rPr>
+        <w:t xml:space="preserve">           ├─ 일반 RESULT ACK → RESULT_ACKED</w:t>
       </w:r>
       <w:r>
         <w:br/>
@@ -2639,7 +2943,39 @@
           <w:color w:val="0F172A"/>
           <w:sz w:val="17"/>
         </w:rPr>
-        <w:t>빈 슬롯의 다음 좌표, 새 블리스터 및 다음 예약의 새 MOVE → MOVE_ACCEPTED</w:t>
+        <w:t xml:space="preserve">           └─ 좌표 10의 R=1 ACK → HOMING → IDLE</w:t>
+      </w:r>
+      <w:r>
+        <w:br/>
+      </w:r>
+      <w:r>
+        <w:rPr>
+          <w:rFonts w:ascii="D2Coding" w:hAnsi="D2Coding" w:eastAsia="D2Coding"/>
+          <w:color w:val="0F172A"/>
+          <w:sz w:val="17"/>
+        </w:rPr>
+      </w:r>
+      <w:r>
+        <w:br/>
+      </w:r>
+      <w:r>
+        <w:rPr>
+          <w:rFonts w:ascii="D2Coding" w:hAnsi="D2Coding" w:eastAsia="D2Coding"/>
+          <w:color w:val="0F172A"/>
+          <w:sz w:val="17"/>
+        </w:rPr>
+        <w:t>TIMED_OUT, 빈 슬롯의 다음 좌표, 새 블리스터 및 다음 예약의 새 MOVE</w:t>
+      </w:r>
+      <w:r>
+        <w:br/>
+      </w:r>
+      <w:r>
+        <w:rPr>
+          <w:rFonts w:ascii="D2Coding" w:hAnsi="D2Coding" w:eastAsia="D2Coding"/>
+          <w:color w:val="0F172A"/>
+          <w:sz w:val="17"/>
+        </w:rPr>
+        <w:t xml:space="preserve">  → MOVE_ACCEPTED</w:t>
       </w:r>
     </w:p>
     <w:tbl>
@@ -2945,7 +3281,7 @@
                 <w:b w:val="0"/>
                 <w:sz w:val="17"/>
               </w:rPr>
-              <w:t>좌표가 같은 새 DISPENSE</w:t>
+              <w:t>같은 MOVE ID의 TIMEOUT</w:t>
             </w:r>
           </w:p>
         </w:tc>
@@ -2961,11 +3297,19 @@
             </w:pPr>
             <w:r>
               <w:rPr>
+                <w:rFonts w:ascii="D2Coding" w:hAnsi="D2Coding" w:eastAsia="D2Coding"/>
+                <w:color w:val="9A3412"/>
+                <w:sz w:val="17"/>
+              </w:rPr>
+              <w:t>TIMED_OUT</w:t>
+            </w:r>
+            <w:r>
+              <w:rPr>
                 <w:rFonts w:ascii="Noto Sans CJK KR" w:hAnsi="Noto Sans CJK KR" w:eastAsia="Noto Sans CJK KR"/>
                 <w:b w:val="0"/>
                 <w:sz w:val="17"/>
               </w:rPr>
-              <w:t>EEPROM 저장, ACK, 서보 1회 시작</w:t>
+              <w:t xml:space="preserve"> 저장, 좌표 유지, TIMEOUT ACK</w:t>
             </w:r>
           </w:p>
         </w:tc>
@@ -3007,6 +3351,68 @@
                 <w:b w:val="0"/>
                 <w:sz w:val="17"/>
               </w:rPr>
+              <w:t>좌표가 같은 새 DISPENSE</w:t>
+            </w:r>
+          </w:p>
+        </w:tc>
+        <w:tc>
+          <w:tcPr>
+            <w:tcW w:type="dxa" w:w="3400"/>
+            <w:vAlign w:val="center"/>
+            <w:shd w:fill="FFFFFF"/>
+          </w:tcPr>
+          <w:p>
+            <w:pPr>
+              <w:spacing w:after="0"/>
+            </w:pPr>
+            <w:r>
+              <w:rPr>
+                <w:rFonts w:ascii="Noto Sans CJK KR" w:hAnsi="Noto Sans CJK KR" w:eastAsia="Noto Sans CJK KR"/>
+                <w:b w:val="0"/>
+                <w:sz w:val="17"/>
+              </w:rPr>
+              <w:t>EEPROM 저장, ACK, 서보 1회 시작</w:t>
+            </w:r>
+          </w:p>
+        </w:tc>
+      </w:tr>
+      <w:tr>
+        <w:tc>
+          <w:tcPr>
+            <w:tcW w:type="dxa" w:w="3400"/>
+            <w:vAlign w:val="center"/>
+            <w:shd w:fill="EAF4FA"/>
+          </w:tcPr>
+          <w:p>
+            <w:pPr>
+              <w:spacing w:after="0"/>
+            </w:pPr>
+            <w:r>
+              <w:rPr>
+                <w:rFonts w:ascii="Noto Sans CJK KR" w:hAnsi="Noto Sans CJK KR" w:eastAsia="Noto Sans CJK KR"/>
+                <w:b w:val="0"/>
+                <w:sz w:val="17"/>
+              </w:rPr>
+              <w:t>READY</w:t>
+            </w:r>
+          </w:p>
+        </w:tc>
+        <w:tc>
+          <w:tcPr>
+            <w:tcW w:type="dxa" w:w="3400"/>
+            <w:vAlign w:val="center"/>
+            <w:shd w:fill="EAF4FA"/>
+          </w:tcPr>
+          <w:p>
+            <w:pPr>
+              <w:spacing w:after="0"/>
+            </w:pPr>
+            <w:r>
+              <w:rPr>
+                <w:rFonts w:ascii="Noto Sans CJK KR" w:hAnsi="Noto Sans CJK KR" w:eastAsia="Noto Sans CJK KR"/>
+                <w:b w:val="0"/>
+                <w:sz w:val="17"/>
+              </w:rPr>
               <w:t>다른 MOVE/DISPENSE</w:t>
             </w:r>
           </w:p>
@@ -3015,7 +3421,7 @@
           <w:tcPr>
             <w:tcW w:type="dxa" w:w="3400"/>
             <w:vAlign w:val="center"/>
-            <w:shd w:fill="FFFFFF"/>
+            <w:shd w:fill="EAF4FA"/>
           </w:tcPr>
           <w:p>
             <w:pPr>
@@ -3037,6 +3443,68 @@
           <w:tcPr>
             <w:tcW w:type="dxa" w:w="3400"/>
             <w:vAlign w:val="center"/>
+            <w:shd w:fill="FFFFFF"/>
+          </w:tcPr>
+          <w:p>
+            <w:pPr>
+              <w:spacing w:after="0"/>
+            </w:pPr>
+            <w:r>
+              <w:rPr>
+                <w:rFonts w:ascii="Noto Sans CJK KR" w:hAnsi="Noto Sans CJK KR" w:eastAsia="Noto Sans CJK KR"/>
+                <w:b w:val="0"/>
+                <w:sz w:val="17"/>
+              </w:rPr>
+              <w:t>TIMED_OUT</w:t>
+            </w:r>
+          </w:p>
+        </w:tc>
+        <w:tc>
+          <w:tcPr>
+            <w:tcW w:type="dxa" w:w="3400"/>
+            <w:vAlign w:val="center"/>
+            <w:shd w:fill="FFFFFF"/>
+          </w:tcPr>
+          <w:p>
+            <w:pPr>
+              <w:spacing w:after="0"/>
+            </w:pPr>
+            <w:r>
+              <w:rPr>
+                <w:rFonts w:ascii="Noto Sans CJK KR" w:hAnsi="Noto Sans CJK KR" w:eastAsia="Noto Sans CJK KR"/>
+                <w:b w:val="0"/>
+                <w:sz w:val="17"/>
+              </w:rPr>
+              <w:t>같은 TIMEOUT</w:t>
+            </w:r>
+          </w:p>
+        </w:tc>
+        <w:tc>
+          <w:tcPr>
+            <w:tcW w:type="dxa" w:w="3400"/>
+            <w:vAlign w:val="center"/>
+            <w:shd w:fill="FFFFFF"/>
+          </w:tcPr>
+          <w:p>
+            <w:pPr>
+              <w:spacing w:after="0"/>
+            </w:pPr>
+            <w:r>
+              <w:rPr>
+                <w:rFonts w:ascii="Noto Sans CJK KR" w:hAnsi="Noto Sans CJK KR" w:eastAsia="Noto Sans CJK KR"/>
+                <w:b w:val="0"/>
+                <w:sz w:val="17"/>
+              </w:rPr>
+              <w:t>상태 변경 없이 TIMEOUT ACK 재전송</w:t>
+            </w:r>
+          </w:p>
+        </w:tc>
+      </w:tr>
+      <w:tr>
+        <w:tc>
+          <w:tcPr>
+            <w:tcW w:type="dxa" w:w="3400"/>
+            <w:vAlign w:val="center"/>
             <w:shd w:fill="EAF4FA"/>
           </w:tcPr>
           <w:p>
@@ -3049,7 +3517,131 @@
                 <w:b w:val="0"/>
                 <w:sz w:val="17"/>
               </w:rPr>
+              <w:t>TIMED_OUT</w:t>
+            </w:r>
+          </w:p>
+        </w:tc>
+        <w:tc>
+          <w:tcPr>
+            <w:tcW w:type="dxa" w:w="3400"/>
+            <w:vAlign w:val="center"/>
+            <w:shd w:fill="EAF4FA"/>
+          </w:tcPr>
+          <w:p>
+            <w:pPr>
+              <w:spacing w:after="0"/>
+            </w:pPr>
+            <w:r>
+              <w:rPr>
+                <w:rFonts w:ascii="Noto Sans CJK KR" w:hAnsi="Noto Sans CJK KR" w:eastAsia="Noto Sans CJK KR"/>
+                <w:b w:val="0"/>
+                <w:sz w:val="17"/>
+              </w:rPr>
+              <w:t>새 요청번호 MOVE</w:t>
+            </w:r>
+          </w:p>
+        </w:tc>
+        <w:tc>
+          <w:tcPr>
+            <w:tcW w:type="dxa" w:w="3400"/>
+            <w:vAlign w:val="center"/>
+            <w:shd w:fill="EAF4FA"/>
+          </w:tcPr>
+          <w:p>
+            <w:pPr>
+              <w:spacing w:after="0"/>
+            </w:pPr>
+            <w:r>
+              <w:rPr>
+                <w:rFonts w:ascii="Noto Sans CJK KR" w:hAnsi="Noto Sans CJK KR" w:eastAsia="Noto Sans CJK KR"/>
+                <w:b w:val="0"/>
+                <w:sz w:val="17"/>
+              </w:rPr>
+              <w:t>EEPROM 저장, 새 좌표 이동 시작</w:t>
+            </w:r>
+          </w:p>
+        </w:tc>
+      </w:tr>
+      <w:tr>
+        <w:tc>
+          <w:tcPr>
+            <w:tcW w:type="dxa" w:w="3400"/>
+            <w:vAlign w:val="center"/>
+            <w:shd w:fill="FFFFFF"/>
+          </w:tcPr>
+          <w:p>
+            <w:pPr>
+              <w:spacing w:after="0"/>
+            </w:pPr>
+            <w:r>
+              <w:rPr>
+                <w:rFonts w:ascii="Noto Sans CJK KR" w:hAnsi="Noto Sans CJK KR" w:eastAsia="Noto Sans CJK KR"/>
+                <w:b w:val="0"/>
+                <w:sz w:val="17"/>
+              </w:rPr>
               <w:t>DISPENSING</w:t>
+            </w:r>
+          </w:p>
+        </w:tc>
+        <w:tc>
+          <w:tcPr>
+            <w:tcW w:type="dxa" w:w="3400"/>
+            <w:vAlign w:val="center"/>
+            <w:shd w:fill="FFFFFF"/>
+          </w:tcPr>
+          <w:p>
+            <w:pPr>
+              <w:spacing w:after="0"/>
+            </w:pPr>
+            <w:r>
+              <w:rPr>
+                <w:rFonts w:ascii="Noto Sans CJK KR" w:hAnsi="Noto Sans CJK KR" w:eastAsia="Noto Sans CJK KR"/>
+                <w:b w:val="0"/>
+                <w:sz w:val="17"/>
+              </w:rPr>
+              <w:t>같은 DISPENSE</w:t>
+            </w:r>
+          </w:p>
+        </w:tc>
+        <w:tc>
+          <w:tcPr>
+            <w:tcW w:type="dxa" w:w="3400"/>
+            <w:vAlign w:val="center"/>
+            <w:shd w:fill="FFFFFF"/>
+          </w:tcPr>
+          <w:p>
+            <w:pPr>
+              <w:spacing w:after="0"/>
+            </w:pPr>
+            <w:r>
+              <w:rPr>
+                <w:rFonts w:ascii="Noto Sans CJK KR" w:hAnsi="Noto Sans CJK KR" w:eastAsia="Noto Sans CJK KR"/>
+                <w:b w:val="0"/>
+                <w:sz w:val="17"/>
+              </w:rPr>
+              <w:t>서보 재시작 금지, ACK만 재전송</w:t>
+            </w:r>
+          </w:p>
+        </w:tc>
+      </w:tr>
+      <w:tr>
+        <w:tc>
+          <w:tcPr>
+            <w:tcW w:type="dxa" w:w="3400"/>
+            <w:vAlign w:val="center"/>
+            <w:shd w:fill="EAF4FA"/>
+          </w:tcPr>
+          <w:p>
+            <w:pPr>
+              <w:spacing w:after="0"/>
+            </w:pPr>
+            <w:r>
+              <w:rPr>
+                <w:rFonts w:ascii="Noto Sans CJK KR" w:hAnsi="Noto Sans CJK KR" w:eastAsia="Noto Sans CJK KR"/>
+                <w:b w:val="0"/>
+                <w:sz w:val="17"/>
+              </w:rPr>
+              <w:t>RESULT_READY</w:t>
             </w:r>
           </w:p>
         </w:tc>
@@ -3089,7 +3681,7 @@
                 <w:b w:val="0"/>
                 <w:sz w:val="17"/>
               </w:rPr>
-              <w:t>서보 재시작 금지, ACK만 재전송</w:t>
+              <w:t>저장된 RESULT 재전송</w:t>
             </w:r>
           </w:p>
         </w:tc>
@@ -3131,7 +3723,7 @@
                 <w:b w:val="0"/>
                 <w:sz w:val="17"/>
               </w:rPr>
-              <w:t>같은 DISPENSE</w:t>
+              <w:t>일반 RESULT ACK</w:t>
             </w:r>
           </w:p>
         </w:tc>
@@ -3151,7 +3743,7 @@
                 <w:b w:val="0"/>
                 <w:sz w:val="17"/>
               </w:rPr>
-              <w:t>저장된 RESULT 재전송</w:t>
+              <w:t>완료 표시, 결과 캐시는 유지</w:t>
             </w:r>
           </w:p>
         </w:tc>
@@ -3193,7 +3785,7 @@
                 <w:b w:val="0"/>
                 <w:sz w:val="17"/>
               </w:rPr>
-              <w:t>RESULT ACK</w:t>
+              <w:t>좌표 10의 R=1 ACK</w:t>
             </w:r>
           </w:p>
         </w:tc>
@@ -3213,7 +3805,7 @@
                 <w:b w:val="0"/>
                 <w:sz w:val="17"/>
               </w:rPr>
-              <w:t>완료 표시, 결과 캐시는 유지</w:t>
+              <w:t>X/Y를 00으로 복귀한 뒤 IDLE</w:t>
             </w:r>
           </w:p>
         </w:tc>
@@ -3337,7 +3929,7 @@
                 <w:b w:val="0"/>
                 <w:sz w:val="17"/>
               </w:rPr>
-              <w:t>ID_CONFLICT, 동작 금지</w:t>
+              <w:t>TIMEOUT 참조를 제외하고 ID_CONFLICT, 동작 금지</w:t>
             </w:r>
           </w:p>
         </w:tc>
@@ -3350,35 +3942,14 @@
     </w:p>
     <w:p>
       <w:pPr>
-        <w:pStyle w:val="Heading2"/>
+        <w:pStyle w:val="Heading3"/>
       </w:pPr>
       <w:r>
         <w:rPr>
           <w:rFonts w:ascii="Noto Sans CJK KR" w:hAnsi="Noto Sans CJK KR" w:eastAsia="Noto Sans CJK KR"/>
           <w:b w:val="0"/>
         </w:rPr>
-        <w:t>6. 중복 방지 저장 규칙</w:t>
-      </w:r>
-    </w:p>
-    <w:p>
-      <w:pPr>
-        <w:pStyle w:val="Heading3"/>
-      </w:pPr>
-      <w:r>
-        <w:rPr>
-          <w:rFonts w:ascii="Noto Sans CJK KR" w:hAnsi="Noto Sans CJK KR" w:eastAsia="Noto Sans CJK KR"/>
-          <w:b w:val="0"/>
-        </w:rPr>
-        <w:t>6.1 저장 항목</w:t>
-      </w:r>
-    </w:p>
-    <w:p>
-      <w:r>
-        <w:rPr>
-          <w:rFonts w:ascii="Noto Sans CJK KR" w:hAnsi="Noto Sans CJK KR" w:eastAsia="Noto Sans CJK KR"/>
-          <w:b w:val="0"/>
-        </w:rPr>
-        <w:t>최소한 다음 값을 EEPROM에 저장한다.</w:t>
+        <w:t>5.1 슬롯 순회와 마지막 홈 복귀</w:t>
       </w:r>
     </w:p>
     <w:p>
@@ -3393,6 +3964,269 @@
           <w:color w:val="0F172A"/>
           <w:sz w:val="17"/>
         </w:rPr>
+        <w:t>00 → 01 → 02 → 03 → 04 → 14 → 13 → 12 → 11 → 10</w:t>
+      </w:r>
+    </w:p>
+    <w:p>
+      <w:pPr>
+        <w:pStyle w:val="ListBullet"/>
+      </w:pPr>
+      <w:r>
+        <w:rPr>
+          <w:rFonts w:ascii="Noto Sans CJK KR" w:hAnsi="Noto Sans CJK KR" w:eastAsia="Noto Sans CJK KR"/>
+          <w:b w:val="0"/>
+        </w:rPr>
+        <w:t xml:space="preserve">최초 위치는 </w:t>
+      </w:r>
+      <w:r>
+        <w:rPr>
+          <w:rFonts w:ascii="D2Coding" w:hAnsi="D2Coding" w:eastAsia="D2Coding"/>
+          <w:color w:val="9A3412"/>
+          <w:sz w:val="18"/>
+        </w:rPr>
+        <w:t>(0,0)</w:t>
+      </w:r>
+      <w:r>
+        <w:rPr>
+          <w:rFonts w:ascii="Noto Sans CJK KR" w:hAnsi="Noto Sans CJK KR" w:eastAsia="Noto Sans CJK KR"/>
+          <w:b w:val="0"/>
+        </w:rPr>
+        <w:t>이다.</w:t>
+      </w:r>
+    </w:p>
+    <w:p>
+      <w:pPr>
+        <w:pStyle w:val="ListBullet"/>
+      </w:pPr>
+      <w:r>
+        <w:rPr>
+          <w:rFonts w:ascii="Noto Sans CJK KR" w:hAnsi="Noto Sans CJK KR" w:eastAsia="Noto Sans CJK KR"/>
+          <w:b w:val="0"/>
+        </w:rPr>
+        <w:t>상단 행은 Y가 증가하는 방향, 하단 행은 Y가 감소하는 방향으로 순회한다.</w:t>
+      </w:r>
+    </w:p>
+    <w:p>
+      <w:pPr>
+        <w:pStyle w:val="ListBullet"/>
+      </w:pPr>
+      <w:r>
+        <w:rPr>
+          <w:rFonts w:ascii="D2Coding" w:hAnsi="D2Coding" w:eastAsia="D2Coding"/>
+          <w:color w:val="9A3412"/>
+          <w:sz w:val="18"/>
+        </w:rPr>
+        <w:t>04→14</w:t>
+      </w:r>
+      <w:r>
+        <w:rPr>
+          <w:rFonts w:ascii="Noto Sans CJK KR" w:hAnsi="Noto Sans CJK KR" w:eastAsia="Noto Sans CJK KR"/>
+          <w:b w:val="0"/>
+        </w:rPr>
+        <w:t xml:space="preserve">는 같은 열에서 행만 바꾸므로 기존 </w:t>
+      </w:r>
+      <w:r>
+        <w:rPr>
+          <w:rFonts w:ascii="D2Coding" w:hAnsi="D2Coding" w:eastAsia="D2Coding"/>
+          <w:color w:val="9A3412"/>
+          <w:sz w:val="18"/>
+        </w:rPr>
+        <w:t>04→10</w:t>
+      </w:r>
+      <w:r>
+        <w:rPr>
+          <w:rFonts w:ascii="Noto Sans CJK KR" w:hAnsi="Noto Sans CJK KR" w:eastAsia="Noto Sans CJK KR"/>
+          <w:b w:val="0"/>
+        </w:rPr>
+        <w:t>보다 이동거리가 짧다.</w:t>
+      </w:r>
+    </w:p>
+    <w:p>
+      <w:pPr>
+        <w:pStyle w:val="ListBullet"/>
+      </w:pPr>
+      <w:r>
+        <w:rPr>
+          <w:rFonts w:ascii="Noto Sans CJK KR" w:hAnsi="Noto Sans CJK KR" w:eastAsia="Noto Sans CJK KR"/>
+          <w:b w:val="0"/>
+        </w:rPr>
+        <w:t xml:space="preserve">마지막 좌표 </w:t>
+      </w:r>
+      <w:r>
+        <w:rPr>
+          <w:rFonts w:ascii="D2Coding" w:hAnsi="D2Coding" w:eastAsia="D2Coding"/>
+          <w:color w:val="9A3412"/>
+          <w:sz w:val="18"/>
+        </w:rPr>
+        <w:t>(1,0)</w:t>
+      </w:r>
+      <w:r>
+        <w:rPr>
+          <w:rFonts w:ascii="Noto Sans CJK KR" w:hAnsi="Noto Sans CJK KR" w:eastAsia="Noto Sans CJK KR"/>
+          <w:b w:val="0"/>
+        </w:rPr>
+        <w:t xml:space="preserve">에서 배출 성공 </w:t>
+      </w:r>
+      <w:r>
+        <w:rPr>
+          <w:rFonts w:ascii="D2Coding" w:hAnsi="D2Coding" w:eastAsia="D2Coding"/>
+          <w:color w:val="9A3412"/>
+          <w:sz w:val="18"/>
+        </w:rPr>
+        <w:t>R=1</w:t>
+      </w:r>
+      <w:r>
+        <w:rPr>
+          <w:rFonts w:ascii="Noto Sans CJK KR" w:hAnsi="Noto Sans CJK KR" w:eastAsia="Noto Sans CJK KR"/>
+          <w:b w:val="0"/>
+        </w:rPr>
+        <w:t xml:space="preserve">을 보내고 Pi의 RESULT ACK를 받으면 X/Y 스테핑모터를 </w:t>
+      </w:r>
+      <w:r>
+        <w:rPr>
+          <w:rFonts w:ascii="D2Coding" w:hAnsi="D2Coding" w:eastAsia="D2Coding"/>
+          <w:color w:val="9A3412"/>
+          <w:sz w:val="18"/>
+        </w:rPr>
+        <w:t>(0,0)</w:t>
+      </w:r>
+      <w:r>
+        <w:rPr>
+          <w:rFonts w:ascii="Noto Sans CJK KR" w:hAnsi="Noto Sans CJK KR" w:eastAsia="Noto Sans CJK KR"/>
+          <w:b w:val="0"/>
+        </w:rPr>
+        <w:t>으로 자동 복귀시킨다.</w:t>
+      </w:r>
+    </w:p>
+    <w:p>
+      <w:pPr>
+        <w:pStyle w:val="ListBullet"/>
+      </w:pPr>
+      <w:r>
+        <w:rPr>
+          <w:rFonts w:ascii="Noto Sans CJK KR" w:hAnsi="Noto Sans CJK KR" w:eastAsia="Noto Sans CJK KR"/>
+          <w:b w:val="0"/>
+        </w:rPr>
+        <w:t xml:space="preserve">홈 복귀가 완료된 후에만 </w:t>
+      </w:r>
+      <w:r>
+        <w:rPr>
+          <w:rFonts w:ascii="D2Coding" w:hAnsi="D2Coding" w:eastAsia="D2Coding"/>
+          <w:color w:val="9A3412"/>
+          <w:sz w:val="18"/>
+        </w:rPr>
+        <w:t>IDLE</w:t>
+      </w:r>
+      <w:r>
+        <w:rPr>
+          <w:rFonts w:ascii="Noto Sans CJK KR" w:hAnsi="Noto Sans CJK KR" w:eastAsia="Noto Sans CJK KR"/>
+          <w:b w:val="0"/>
+        </w:rPr>
+        <w:t xml:space="preserve">로 전환한다. 복귀 중 신규 MOVE/DISPENSE는 </w:t>
+      </w:r>
+      <w:r>
+        <w:rPr>
+          <w:rFonts w:ascii="D2Coding" w:hAnsi="D2Coding" w:eastAsia="D2Coding"/>
+          <w:color w:val="9A3412"/>
+          <w:sz w:val="18"/>
+        </w:rPr>
+        <w:t>BUSY</w:t>
+      </w:r>
+      <w:r>
+        <w:rPr>
+          <w:rFonts w:ascii="Noto Sans CJK KR" w:hAnsi="Noto Sans CJK KR" w:eastAsia="Noto Sans CJK KR"/>
+          <w:b w:val="0"/>
+        </w:rPr>
+        <w:t xml:space="preserve"> 처리한다.</w:t>
+      </w:r>
+    </w:p>
+    <w:p>
+      <w:pPr>
+        <w:pStyle w:val="ListBullet"/>
+      </w:pPr>
+      <w:r>
+        <w:rPr>
+          <w:rFonts w:ascii="Noto Sans CJK KR" w:hAnsi="Noto Sans CJK KR" w:eastAsia="Noto Sans CJK KR"/>
+          <w:b w:val="0"/>
+        </w:rPr>
+        <w:t xml:space="preserve">마지막 결과가 </w:t>
+      </w:r>
+      <w:r>
+        <w:rPr>
+          <w:rFonts w:ascii="D2Coding" w:hAnsi="D2Coding" w:eastAsia="D2Coding"/>
+          <w:color w:val="9A3412"/>
+          <w:sz w:val="18"/>
+        </w:rPr>
+        <w:t>R=0</w:t>
+      </w:r>
+      <w:r>
+        <w:rPr>
+          <w:rFonts w:ascii="Noto Sans CJK KR" w:hAnsi="Noto Sans CJK KR" w:eastAsia="Noto Sans CJK KR"/>
+          <w:b w:val="0"/>
+        </w:rPr>
+        <w:t xml:space="preserve"> 또는 </w:t>
+      </w:r>
+      <w:r>
+        <w:rPr>
+          <w:rFonts w:ascii="D2Coding" w:hAnsi="D2Coding" w:eastAsia="D2Coding"/>
+          <w:color w:val="9A3412"/>
+          <w:sz w:val="18"/>
+        </w:rPr>
+        <w:t>R=2</w:t>
+      </w:r>
+      <w:r>
+        <w:rPr>
+          <w:rFonts w:ascii="Noto Sans CJK KR" w:hAnsi="Noto Sans CJK KR" w:eastAsia="Noto Sans CJK KR"/>
+          <w:b w:val="0"/>
+        </w:rPr>
+        <w:t>이면 자동 홈 복귀 조건이 아니다.</w:t>
+      </w:r>
+    </w:p>
+    <w:p>
+      <w:pPr>
+        <w:pStyle w:val="Heading2"/>
+      </w:pPr>
+      <w:r>
+        <w:rPr>
+          <w:rFonts w:ascii="Noto Sans CJK KR" w:hAnsi="Noto Sans CJK KR" w:eastAsia="Noto Sans CJK KR"/>
+          <w:b w:val="0"/>
+        </w:rPr>
+        <w:t>6. 중복 방지 저장 규칙</w:t>
+      </w:r>
+    </w:p>
+    <w:p>
+      <w:pPr>
+        <w:pStyle w:val="Heading3"/>
+      </w:pPr>
+      <w:r>
+        <w:rPr>
+          <w:rFonts w:ascii="Noto Sans CJK KR" w:hAnsi="Noto Sans CJK KR" w:eastAsia="Noto Sans CJK KR"/>
+          <w:b w:val="0"/>
+        </w:rPr>
+        <w:t>6.1 저장 항목</w:t>
+      </w:r>
+    </w:p>
+    <w:p>
+      <w:r>
+        <w:rPr>
+          <w:rFonts w:ascii="Noto Sans CJK KR" w:hAnsi="Noto Sans CJK KR" w:eastAsia="Noto Sans CJK KR"/>
+          <w:b w:val="0"/>
+        </w:rPr>
+        <w:t>최소한 다음 값을 EEPROM에 저장한다.</w:t>
+      </w:r>
+    </w:p>
+    <w:p>
+      <w:pPr>
+        <w:spacing w:before="60" w:after="140"/>
+        <w:ind w:left="198" w:right="198"/>
+        <w:shd w:fill="F1F5F9"/>
+      </w:pPr>
+      <w:r>
+        <w:rPr>
+          <w:rFonts w:ascii="D2Coding" w:hAnsi="D2Coding" w:eastAsia="D2Coding"/>
+          <w:color w:val="0F172A"/>
+          <w:sz w:val="17"/>
+        </w:rPr>
         <w:t>magic/version</w:t>
       </w:r>
       <w:r>
@@ -3426,7 +4260,7 @@
           <w:color w:val="0F172A"/>
           <w:sz w:val="17"/>
         </w:rPr>
-        <w:t>move_state: NONE / ACCEPTED / MOVING / READY</w:t>
+        <w:t>move_state: NONE / ACCEPTED / MOVING / READY / TIMED_OUT</w:t>
       </w:r>
       <w:r>
         <w:br/>
@@ -3481,6 +4315,17 @@
           <w:color w:val="0F172A"/>
           <w:sz w:val="17"/>
         </w:rPr>
+        <w:t>home_pending, current_position_x, current_position_y</w:t>
+      </w:r>
+      <w:r>
+        <w:br/>
+      </w:r>
+      <w:r>
+        <w:rPr>
+          <w:rFonts w:ascii="D2Coding" w:hAnsi="D2Coding" w:eastAsia="D2Coding"/>
+          <w:color w:val="0F172A"/>
+          <w:sz w:val="17"/>
+        </w:rPr>
         <w:t>record_crc</w:t>
       </w:r>
     </w:p>
@@ -3788,6 +4633,128 @@
           <w:rFonts w:ascii="Noto Sans CJK KR" w:hAnsi="Noto Sans CJK KR" w:eastAsia="Noto Sans CJK KR"/>
           <w:b w:val="0"/>
         </w:rPr>
+        <w:t>TIMEOUT:</w:t>
+      </w:r>
+    </w:p>
+    <w:p>
+      <w:pPr>
+        <w:pStyle w:val="ListNumber"/>
+      </w:pPr>
+      <w:r>
+        <w:rPr>
+          <w:rFonts w:ascii="Noto Sans CJK KR" w:hAnsi="Noto Sans CJK KR" w:eastAsia="Noto Sans CJK KR"/>
+          <w:b w:val="0"/>
+        </w:rPr>
+        <w:t>프레임과 MOVE 요청번호 일치 검증</w:t>
+      </w:r>
+    </w:p>
+    <w:p>
+      <w:pPr>
+        <w:pStyle w:val="ListNumber"/>
+      </w:pPr>
+      <w:r>
+        <w:rPr>
+          <w:rFonts w:ascii="Noto Sans CJK KR" w:hAnsi="Noto Sans CJK KR" w:eastAsia="Noto Sans CJK KR"/>
+          <w:b w:val="0"/>
+        </w:rPr>
+        <w:t xml:space="preserve">현재 </w:t>
+      </w:r>
+      <w:r>
+        <w:rPr>
+          <w:rFonts w:ascii="D2Coding" w:hAnsi="D2Coding" w:eastAsia="D2Coding"/>
+          <w:color w:val="9A3412"/>
+          <w:sz w:val="18"/>
+        </w:rPr>
+        <w:t>READY</w:t>
+      </w:r>
+      <w:r>
+        <w:rPr>
+          <w:rFonts w:ascii="Noto Sans CJK KR" w:hAnsi="Noto Sans CJK KR" w:eastAsia="Noto Sans CJK KR"/>
+          <w:b w:val="0"/>
+        </w:rPr>
+        <w:t xml:space="preserve">이면 EEPROM에 </w:t>
+      </w:r>
+      <w:r>
+        <w:rPr>
+          <w:rFonts w:ascii="D2Coding" w:hAnsi="D2Coding" w:eastAsia="D2Coding"/>
+          <w:color w:val="9A3412"/>
+          <w:sz w:val="18"/>
+        </w:rPr>
+        <w:t>TIMED_OUT</w:t>
+      </w:r>
+      <w:r>
+        <w:rPr>
+          <w:rFonts w:ascii="Noto Sans CJK KR" w:hAnsi="Noto Sans CJK KR" w:eastAsia="Noto Sans CJK KR"/>
+          <w:b w:val="0"/>
+        </w:rPr>
+        <w:t xml:space="preserve"> 기록과 CRC 확인</w:t>
+      </w:r>
+    </w:p>
+    <w:p>
+      <w:pPr>
+        <w:pStyle w:val="ListNumber"/>
+      </w:pPr>
+      <w:r>
+        <w:rPr>
+          <w:rFonts w:ascii="Noto Sans CJK KR" w:hAnsi="Noto Sans CJK KR" w:eastAsia="Noto Sans CJK KR"/>
+          <w:b w:val="0"/>
+        </w:rPr>
+        <w:t>서보 허용 상태 해제, 좌표 유지</w:t>
+      </w:r>
+    </w:p>
+    <w:p>
+      <w:pPr>
+        <w:pStyle w:val="ListNumber"/>
+      </w:pPr>
+      <w:r>
+        <w:rPr>
+          <w:rFonts w:ascii="D2Coding" w:hAnsi="D2Coding" w:eastAsia="D2Coding"/>
+          <w:color w:val="9A3412"/>
+          <w:sz w:val="18"/>
+        </w:rPr>
+        <w:t>ACK|요청번호|TIMEOUT</w:t>
+      </w:r>
+      <w:r>
+        <w:rPr>
+          <w:rFonts w:ascii="Noto Sans CJK KR" w:hAnsi="Noto Sans CJK KR" w:eastAsia="Noto Sans CJK KR"/>
+          <w:b w:val="0"/>
+        </w:rPr>
+        <w:t xml:space="preserve"> 전송</w:t>
+      </w:r>
+    </w:p>
+    <w:p>
+      <w:pPr>
+        <w:pStyle w:val="ListNumber"/>
+      </w:pPr>
+      <w:r>
+        <w:rPr>
+          <w:rFonts w:ascii="Noto Sans CJK KR" w:hAnsi="Noto Sans CJK KR" w:eastAsia="Noto Sans CJK KR"/>
+          <w:b w:val="0"/>
+        </w:rPr>
+        <w:t xml:space="preserve">이미 </w:t>
+      </w:r>
+      <w:r>
+        <w:rPr>
+          <w:rFonts w:ascii="D2Coding" w:hAnsi="D2Coding" w:eastAsia="D2Coding"/>
+          <w:color w:val="9A3412"/>
+          <w:sz w:val="18"/>
+        </w:rPr>
+        <w:t>TIMED_OUT</w:t>
+      </w:r>
+      <w:r>
+        <w:rPr>
+          <w:rFonts w:ascii="Noto Sans CJK KR" w:hAnsi="Noto Sans CJK KR" w:eastAsia="Noto Sans CJK KR"/>
+          <w:b w:val="0"/>
+        </w:rPr>
+        <w:t>이면 EEPROM 재기록 없이 ACK만 재전송</w:t>
+      </w:r>
+    </w:p>
+    <w:p>
+      <w:r>
+        <w:rPr>
+          <w:rFonts w:ascii="Noto Sans CJK KR" w:hAnsi="Noto Sans CJK KR" w:eastAsia="Noto Sans CJK KR"/>
+          <w:b w:val="0"/>
+        </w:rPr>
         <w:t>EEPROM 기록이 완료되지 않으면 모터를 시작하면 안 된다.</w:t>
       </w:r>
     </w:p>
@@ -3813,6 +4780,18 @@
           <w:b w:val="0"/>
         </w:rPr>
         <w:t>READY 또는 RESULT_READY 상태였다면 저장된 WAIT 또는 RESULT를 재전송할 수 있다.</w:t>
+      </w:r>
+    </w:p>
+    <w:p>
+      <w:pPr>
+        <w:pStyle w:val="ListBullet"/>
+      </w:pPr>
+      <w:r>
+        <w:rPr>
+          <w:rFonts w:ascii="Noto Sans CJK KR" w:hAnsi="Noto Sans CJK KR" w:eastAsia="Noto Sans CJK KR"/>
+          <w:b w:val="0"/>
+        </w:rPr>
+        <w:t>TIMED_OUT 상태였다면 같은 TIMEOUT에 ACK하고 새 MOVE를 받을 수 있다.</w:t>
       </w:r>
     </w:p>
     <w:p>
@@ -3981,6 +4960,33 @@
     </w:p>
     <w:p>
       <w:pPr>
+        <w:pStyle w:val="ListBullet"/>
+      </w:pPr>
+      <w:r>
+        <w:rPr>
+          <w:rFonts w:ascii="Noto Sans CJK KR" w:hAnsi="Noto Sans CJK KR" w:eastAsia="Noto Sans CJK KR"/>
+          <w:b w:val="0"/>
+        </w:rPr>
+        <w:t xml:space="preserve">파싱 실패 시 요청번호 복구를 시도하지 않고 </w:t>
+      </w:r>
+      <w:r>
+        <w:rPr>
+          <w:rFonts w:ascii="D2Coding" w:hAnsi="D2Coding" w:eastAsia="D2Coding"/>
+          <w:color w:val="9A3412"/>
+          <w:sz w:val="18"/>
+        </w:rPr>
+        <w:t>ERROR|INVALID_FORMAT</w:t>
+      </w:r>
+      <w:r>
+        <w:rPr>
+          <w:rFonts w:ascii="Noto Sans CJK KR" w:hAnsi="Noto Sans CJK KR" w:eastAsia="Noto Sans CJK KR"/>
+          <w:b w:val="0"/>
+        </w:rPr>
+        <w:t>을 보낸 뒤 Pi의 마지막 프레임 재수신을 기다린다. 모터 상태는 변경하지 않는다.</w:t>
+      </w:r>
+    </w:p>
+    <w:p>
+      <w:pPr>
         <w:pStyle w:val="Heading2"/>
       </w:pPr>
       <w:r>
@@ -4069,7 +5075,7 @@
           <w:rFonts w:ascii="Noto Sans CJK KR" w:hAnsi="Noto Sans CJK KR" w:eastAsia="Noto Sans CJK KR"/>
           <w:b w:val="0"/>
         </w:rPr>
-        <w:t>ATmega는 Pi의 벽시계를 신뢰할 필요가 없다. 허용시간 종료 판정과 신규 전송 중단은 Pi가 담당한다.</w:t>
+        <w:t>ATmega는 Pi의 벽시계를 신뢰할 필요가 없다. 허용시간 종료 판정은 Pi가 담당하고, ATmega는 Pi의 TIMEOUT을 받아 READY를 해제한다.</w:t>
       </w:r>
     </w:p>
     <w:p>
@@ -4178,6 +5184,54 @@
           <w:b w:val="0"/>
         </w:rPr>
         <w:t>요청번호·상태·결과가 EEPROM CRC 검증에 실패하면 모터를 금지한다.</w:t>
+      </w:r>
+    </w:p>
+    <w:p>
+      <w:pPr>
+        <w:pStyle w:val="ListNumber"/>
+      </w:pPr>
+      <w:r>
+        <w:rPr>
+          <w:rFonts w:ascii="Noto Sans CJK KR" w:hAnsi="Noto Sans CJK KR" w:eastAsia="Noto Sans CJK KR"/>
+          <w:b w:val="0"/>
+        </w:rPr>
+        <w:t>TIMEOUT은 모터를 구동하지 않고 좌표를 변경하지 않는다.</w:t>
+      </w:r>
+    </w:p>
+    <w:p>
+      <w:pPr>
+        <w:pStyle w:val="ListNumber"/>
+      </w:pPr>
+      <w:r>
+        <w:rPr>
+          <w:rFonts w:ascii="Noto Sans CJK KR" w:hAnsi="Noto Sans CJK KR" w:eastAsia="Noto Sans CJK KR"/>
+          <w:b w:val="0"/>
+        </w:rPr>
+        <w:t>TIMEOUT ACK 전에는 다음 신규 MOVE를 처리하지 않는다.</w:t>
+      </w:r>
+    </w:p>
+    <w:p>
+      <w:pPr>
+        <w:pStyle w:val="ListNumber"/>
+      </w:pPr>
+      <w:r>
+        <w:rPr>
+          <w:rFonts w:ascii="Noto Sans CJK KR" w:hAnsi="Noto Sans CJK KR" w:eastAsia="Noto Sans CJK KR"/>
+          <w:b w:val="0"/>
+        </w:rPr>
+        <w:t>마지막 좌표 10의 성공 RESULT ACK 후 홈 복귀가 끝나기 전에는 IDLE로 표시하지 않는다.</w:t>
+      </w:r>
+    </w:p>
+    <w:p>
+      <w:pPr>
+        <w:pStyle w:val="ListNumber"/>
+      </w:pPr>
+      <w:r>
+        <w:rPr>
+          <w:rFonts w:ascii="Noto Sans CJK KR" w:hAnsi="Noto Sans CJK KR" w:eastAsia="Noto Sans CJK KR"/>
+          <w:b w:val="0"/>
+        </w:rPr>
+        <w:t>INVALID_FORMAT 송신만으로 현재 요청을 실패·완료 처리하거나 모터를 다시 구동하지 않는다.</w:t>
       </w:r>
     </w:p>
     <w:p>
@@ -5264,6 +6318,502 @@
           </w:p>
         </w:tc>
       </w:tr>
+      <w:tr>
+        <w:tc>
+          <w:tcPr>
+            <w:tcW w:type="dxa" w:w="3400"/>
+            <w:vAlign w:val="center"/>
+            <w:shd w:fill="FFFFFF"/>
+          </w:tcPr>
+          <w:p>
+            <w:pPr>
+              <w:spacing w:after="0"/>
+            </w:pPr>
+            <w:r>
+              <w:rPr>
+                <w:rFonts w:ascii="Noto Sans CJK KR" w:hAnsi="Noto Sans CJK KR" w:eastAsia="Noto Sans CJK KR"/>
+                <w:b w:val="0"/>
+                <w:sz w:val="17"/>
+              </w:rPr>
+              <w:t>AT-17</w:t>
+            </w:r>
+          </w:p>
+        </w:tc>
+        <w:tc>
+          <w:tcPr>
+            <w:tcW w:type="dxa" w:w="3400"/>
+            <w:vAlign w:val="center"/>
+            <w:shd w:fill="FFFFFF"/>
+          </w:tcPr>
+          <w:p>
+            <w:pPr>
+              <w:spacing w:after="0"/>
+            </w:pPr>
+            <w:r>
+              <w:rPr>
+                <w:rFonts w:ascii="Noto Sans CJK KR" w:hAnsi="Noto Sans CJK KR" w:eastAsia="Noto Sans CJK KR"/>
+                <w:b w:val="0"/>
+                <w:sz w:val="17"/>
+              </w:rPr>
+              <w:t>READY 허용시간 종료</w:t>
+            </w:r>
+          </w:p>
+        </w:tc>
+        <w:tc>
+          <w:tcPr>
+            <w:tcW w:type="dxa" w:w="3400"/>
+            <w:vAlign w:val="center"/>
+            <w:shd w:fill="FFFFFF"/>
+          </w:tcPr>
+          <w:p>
+            <w:pPr>
+              <w:spacing w:after="0"/>
+            </w:pPr>
+            <w:r>
+              <w:rPr>
+                <w:rFonts w:ascii="Noto Sans CJK KR" w:hAnsi="Noto Sans CJK KR" w:eastAsia="Noto Sans CJK KR"/>
+                <w:b w:val="0"/>
+                <w:sz w:val="17"/>
+              </w:rPr>
+              <w:t>TIMEOUT 수신, 좌표 유지, TIMEOUT ACK, 서보 미동작</w:t>
+            </w:r>
+          </w:p>
+        </w:tc>
+      </w:tr>
+      <w:tr>
+        <w:tc>
+          <w:tcPr>
+            <w:tcW w:type="dxa" w:w="3400"/>
+            <w:vAlign w:val="center"/>
+            <w:shd w:fill="EAF4FA"/>
+          </w:tcPr>
+          <w:p>
+            <w:pPr>
+              <w:spacing w:after="0"/>
+            </w:pPr>
+            <w:r>
+              <w:rPr>
+                <w:rFonts w:ascii="Noto Sans CJK KR" w:hAnsi="Noto Sans CJK KR" w:eastAsia="Noto Sans CJK KR"/>
+                <w:b w:val="0"/>
+                <w:sz w:val="17"/>
+              </w:rPr>
+              <w:t>AT-18</w:t>
+            </w:r>
+          </w:p>
+        </w:tc>
+        <w:tc>
+          <w:tcPr>
+            <w:tcW w:type="dxa" w:w="3400"/>
+            <w:vAlign w:val="center"/>
+            <w:shd w:fill="EAF4FA"/>
+          </w:tcPr>
+          <w:p>
+            <w:pPr>
+              <w:spacing w:after="0"/>
+            </w:pPr>
+            <w:r>
+              <w:rPr>
+                <w:rFonts w:ascii="Noto Sans CJK KR" w:hAnsi="Noto Sans CJK KR" w:eastAsia="Noto Sans CJK KR"/>
+                <w:b w:val="0"/>
+                <w:sz w:val="17"/>
+              </w:rPr>
+              <w:t>TIMEOUT ACK 유실</w:t>
+            </w:r>
+          </w:p>
+        </w:tc>
+        <w:tc>
+          <w:tcPr>
+            <w:tcW w:type="dxa" w:w="3400"/>
+            <w:vAlign w:val="center"/>
+            <w:shd w:fill="EAF4FA"/>
+          </w:tcPr>
+          <w:p>
+            <w:pPr>
+              <w:spacing w:after="0"/>
+            </w:pPr>
+            <w:r>
+              <w:rPr>
+                <w:rFonts w:ascii="Noto Sans CJK KR" w:hAnsi="Noto Sans CJK KR" w:eastAsia="Noto Sans CJK KR"/>
+                <w:b w:val="0"/>
+                <w:sz w:val="17"/>
+              </w:rPr>
+              <w:t>같은 TIMEOUT 재수신에 ACK만 재전송</w:t>
+            </w:r>
+          </w:p>
+        </w:tc>
+      </w:tr>
+      <w:tr>
+        <w:tc>
+          <w:tcPr>
+            <w:tcW w:type="dxa" w:w="3400"/>
+            <w:vAlign w:val="center"/>
+            <w:shd w:fill="FFFFFF"/>
+          </w:tcPr>
+          <w:p>
+            <w:pPr>
+              <w:spacing w:after="0"/>
+            </w:pPr>
+            <w:r>
+              <w:rPr>
+                <w:rFonts w:ascii="Noto Sans CJK KR" w:hAnsi="Noto Sans CJK KR" w:eastAsia="Noto Sans CJK KR"/>
+                <w:b w:val="0"/>
+                <w:sz w:val="17"/>
+              </w:rPr>
+              <w:t>AT-19</w:t>
+            </w:r>
+          </w:p>
+        </w:tc>
+        <w:tc>
+          <w:tcPr>
+            <w:tcW w:type="dxa" w:w="3400"/>
+            <w:vAlign w:val="center"/>
+            <w:shd w:fill="FFFFFF"/>
+          </w:tcPr>
+          <w:p>
+            <w:pPr>
+              <w:spacing w:after="0"/>
+            </w:pPr>
+            <w:r>
+              <w:rPr>
+                <w:rFonts w:ascii="Noto Sans CJK KR" w:hAnsi="Noto Sans CJK KR" w:eastAsia="Noto Sans CJK KR"/>
+                <w:b w:val="0"/>
+                <w:sz w:val="17"/>
+              </w:rPr>
+              <w:t>TIMEOUT 후 신규 MOVE</w:t>
+            </w:r>
+          </w:p>
+        </w:tc>
+        <w:tc>
+          <w:tcPr>
+            <w:tcW w:type="dxa" w:w="3400"/>
+            <w:vAlign w:val="center"/>
+            <w:shd w:fill="FFFFFF"/>
+          </w:tcPr>
+          <w:p>
+            <w:pPr>
+              <w:spacing w:after="0"/>
+            </w:pPr>
+            <w:r>
+              <w:rPr>
+                <w:rFonts w:ascii="Noto Sans CJK KR" w:hAnsi="Noto Sans CJK KR" w:eastAsia="Noto Sans CJK KR"/>
+                <w:b w:val="0"/>
+                <w:sz w:val="17"/>
+              </w:rPr>
+              <w:t>신규 MOVE 수용, BUSY 미발생</w:t>
+            </w:r>
+          </w:p>
+        </w:tc>
+      </w:tr>
+      <w:tr>
+        <w:tc>
+          <w:tcPr>
+            <w:tcW w:type="dxa" w:w="3400"/>
+            <w:vAlign w:val="center"/>
+            <w:shd w:fill="EAF4FA"/>
+          </w:tcPr>
+          <w:p>
+            <w:pPr>
+              <w:spacing w:after="0"/>
+            </w:pPr>
+            <w:r>
+              <w:rPr>
+                <w:rFonts w:ascii="Noto Sans CJK KR" w:hAnsi="Noto Sans CJK KR" w:eastAsia="Noto Sans CJK KR"/>
+                <w:b w:val="0"/>
+                <w:sz w:val="17"/>
+              </w:rPr>
+              <w:t>AT-20</w:t>
+            </w:r>
+          </w:p>
+        </w:tc>
+        <w:tc>
+          <w:tcPr>
+            <w:tcW w:type="dxa" w:w="3400"/>
+            <w:vAlign w:val="center"/>
+            <w:shd w:fill="EAF4FA"/>
+          </w:tcPr>
+          <w:p>
+            <w:pPr>
+              <w:spacing w:after="0"/>
+            </w:pPr>
+            <w:r>
+              <w:rPr>
+                <w:rFonts w:ascii="Noto Sans CJK KR" w:hAnsi="Noto Sans CJK KR" w:eastAsia="Noto Sans CJK KR"/>
+                <w:b w:val="0"/>
+                <w:sz w:val="17"/>
+              </w:rPr>
+              <w:t>TIMEOUT 후 전원 재인가</w:t>
+            </w:r>
+          </w:p>
+        </w:tc>
+        <w:tc>
+          <w:tcPr>
+            <w:tcW w:type="dxa" w:w="3400"/>
+            <w:vAlign w:val="center"/>
+            <w:shd w:fill="EAF4FA"/>
+          </w:tcPr>
+          <w:p>
+            <w:pPr>
+              <w:spacing w:after="0"/>
+            </w:pPr>
+            <w:r>
+              <w:rPr>
+                <w:rFonts w:ascii="Noto Sans CJK KR" w:hAnsi="Noto Sans CJK KR" w:eastAsia="Noto Sans CJK KR"/>
+                <w:b w:val="0"/>
+                <w:sz w:val="17"/>
+              </w:rPr>
+              <w:t>TIMED_OUT 복구, 중복 TIMEOUT ACK와 신규 MOVE 수용</w:t>
+            </w:r>
+          </w:p>
+        </w:tc>
+      </w:tr>
+      <w:tr>
+        <w:tc>
+          <w:tcPr>
+            <w:tcW w:type="dxa" w:w="3400"/>
+            <w:vAlign w:val="center"/>
+            <w:shd w:fill="FFFFFF"/>
+          </w:tcPr>
+          <w:p>
+            <w:pPr>
+              <w:spacing w:after="0"/>
+            </w:pPr>
+            <w:r>
+              <w:rPr>
+                <w:rFonts w:ascii="Noto Sans CJK KR" w:hAnsi="Noto Sans CJK KR" w:eastAsia="Noto Sans CJK KR"/>
+                <w:b w:val="0"/>
+                <w:sz w:val="17"/>
+              </w:rPr>
+              <w:t>AT-21</w:t>
+            </w:r>
+          </w:p>
+        </w:tc>
+        <w:tc>
+          <w:tcPr>
+            <w:tcW w:type="dxa" w:w="3400"/>
+            <w:vAlign w:val="center"/>
+            <w:shd w:fill="FFFFFF"/>
+          </w:tcPr>
+          <w:p>
+            <w:pPr>
+              <w:spacing w:after="0"/>
+            </w:pPr>
+            <w:r>
+              <w:rPr>
+                <w:rFonts w:ascii="Noto Sans CJK KR" w:hAnsi="Noto Sans CJK KR" w:eastAsia="Noto Sans CJK KR"/>
+                <w:b w:val="0"/>
+                <w:sz w:val="17"/>
+              </w:rPr>
+              <w:t>지그재그 전 좌표 순회</w:t>
+            </w:r>
+          </w:p>
+        </w:tc>
+        <w:tc>
+          <w:tcPr>
+            <w:tcW w:type="dxa" w:w="3400"/>
+            <w:vAlign w:val="center"/>
+            <w:shd w:fill="FFFFFF"/>
+          </w:tcPr>
+          <w:p>
+            <w:pPr>
+              <w:spacing w:after="0"/>
+            </w:pPr>
+            <w:r>
+              <w:rPr>
+                <w:rFonts w:ascii="Noto Sans CJK KR" w:hAnsi="Noto Sans CJK KR" w:eastAsia="Noto Sans CJK KR"/>
+                <w:b w:val="0"/>
+                <w:sz w:val="17"/>
+              </w:rPr>
+              <w:t>00→01→02→03→04→14→13→12→11→10 순서</w:t>
+            </w:r>
+          </w:p>
+        </w:tc>
+      </w:tr>
+      <w:tr>
+        <w:tc>
+          <w:tcPr>
+            <w:tcW w:type="dxa" w:w="3400"/>
+            <w:vAlign w:val="center"/>
+            <w:shd w:fill="EAF4FA"/>
+          </w:tcPr>
+          <w:p>
+            <w:pPr>
+              <w:spacing w:after="0"/>
+            </w:pPr>
+            <w:r>
+              <w:rPr>
+                <w:rFonts w:ascii="Noto Sans CJK KR" w:hAnsi="Noto Sans CJK KR" w:eastAsia="Noto Sans CJK KR"/>
+                <w:b w:val="0"/>
+                <w:sz w:val="17"/>
+              </w:rPr>
+              <w:t>AT-22</w:t>
+            </w:r>
+          </w:p>
+        </w:tc>
+        <w:tc>
+          <w:tcPr>
+            <w:tcW w:type="dxa" w:w="3400"/>
+            <w:vAlign w:val="center"/>
+            <w:shd w:fill="EAF4FA"/>
+          </w:tcPr>
+          <w:p>
+            <w:pPr>
+              <w:spacing w:after="0"/>
+            </w:pPr>
+            <w:r>
+              <w:rPr>
+                <w:rFonts w:ascii="Noto Sans CJK KR" w:hAnsi="Noto Sans CJK KR" w:eastAsia="Noto Sans CJK KR"/>
+                <w:b w:val="0"/>
+                <w:sz w:val="17"/>
+              </w:rPr>
+              <w:t>마지막 성공 후 홈 복귀</w:t>
+            </w:r>
+          </w:p>
+        </w:tc>
+        <w:tc>
+          <w:tcPr>
+            <w:tcW w:type="dxa" w:w="3400"/>
+            <w:vAlign w:val="center"/>
+            <w:shd w:fill="EAF4FA"/>
+          </w:tcPr>
+          <w:p>
+            <w:pPr>
+              <w:spacing w:after="0"/>
+            </w:pPr>
+            <w:r>
+              <w:rPr>
+                <w:rFonts w:ascii="Noto Sans CJK KR" w:hAnsi="Noto Sans CJK KR" w:eastAsia="Noto Sans CJK KR"/>
+                <w:b w:val="0"/>
+                <w:sz w:val="17"/>
+              </w:rPr>
+              <w:t>좌표 10의 R=1 ACK 후 00 복귀, 그 뒤 IDLE</w:t>
+            </w:r>
+          </w:p>
+        </w:tc>
+      </w:tr>
+      <w:tr>
+        <w:tc>
+          <w:tcPr>
+            <w:tcW w:type="dxa" w:w="3400"/>
+            <w:vAlign w:val="center"/>
+            <w:shd w:fill="FFFFFF"/>
+          </w:tcPr>
+          <w:p>
+            <w:pPr>
+              <w:spacing w:after="0"/>
+            </w:pPr>
+            <w:r>
+              <w:rPr>
+                <w:rFonts w:ascii="Noto Sans CJK KR" w:hAnsi="Noto Sans CJK KR" w:eastAsia="Noto Sans CJK KR"/>
+                <w:b w:val="0"/>
+                <w:sz w:val="17"/>
+              </w:rPr>
+              <w:t>AT-23</w:t>
+            </w:r>
+          </w:p>
+        </w:tc>
+        <w:tc>
+          <w:tcPr>
+            <w:tcW w:type="dxa" w:w="3400"/>
+            <w:vAlign w:val="center"/>
+            <w:shd w:fill="FFFFFF"/>
+          </w:tcPr>
+          <w:p>
+            <w:pPr>
+              <w:spacing w:after="0"/>
+            </w:pPr>
+            <w:r>
+              <w:rPr>
+                <w:rFonts w:ascii="Noto Sans CJK KR" w:hAnsi="Noto Sans CJK KR" w:eastAsia="Noto Sans CJK KR"/>
+                <w:b w:val="0"/>
+                <w:sz w:val="17"/>
+              </w:rPr>
+              <w:t>MOVE INVALID_FORMAT</w:t>
+            </w:r>
+          </w:p>
+        </w:tc>
+        <w:tc>
+          <w:tcPr>
+            <w:tcW w:type="dxa" w:w="3400"/>
+            <w:vAlign w:val="center"/>
+            <w:shd w:fill="FFFFFF"/>
+          </w:tcPr>
+          <w:p>
+            <w:pPr>
+              <w:spacing w:after="0"/>
+            </w:pPr>
+            <w:r>
+              <w:rPr>
+                <w:rFonts w:ascii="Noto Sans CJK KR" w:hAnsi="Noto Sans CJK KR" w:eastAsia="Noto Sans CJK KR"/>
+                <w:b w:val="0"/>
+                <w:sz w:val="17"/>
+              </w:rPr>
+              <w:t>Pi의 같은 MOVE 재전송, 스테핑 중복 구동 없음</w:t>
+            </w:r>
+          </w:p>
+        </w:tc>
+      </w:tr>
+      <w:tr>
+        <w:tc>
+          <w:tcPr>
+            <w:tcW w:type="dxa" w:w="3400"/>
+            <w:vAlign w:val="center"/>
+            <w:shd w:fill="EAF4FA"/>
+          </w:tcPr>
+          <w:p>
+            <w:pPr>
+              <w:spacing w:after="0"/>
+            </w:pPr>
+            <w:r>
+              <w:rPr>
+                <w:rFonts w:ascii="Noto Sans CJK KR" w:hAnsi="Noto Sans CJK KR" w:eastAsia="Noto Sans CJK KR"/>
+                <w:b w:val="0"/>
+                <w:sz w:val="17"/>
+              </w:rPr>
+              <w:t>AT-24</w:t>
+            </w:r>
+          </w:p>
+        </w:tc>
+        <w:tc>
+          <w:tcPr>
+            <w:tcW w:type="dxa" w:w="3400"/>
+            <w:vAlign w:val="center"/>
+            <w:shd w:fill="EAF4FA"/>
+          </w:tcPr>
+          <w:p>
+            <w:pPr>
+              <w:spacing w:after="0"/>
+            </w:pPr>
+            <w:r>
+              <w:rPr>
+                <w:rFonts w:ascii="Noto Sans CJK KR" w:hAnsi="Noto Sans CJK KR" w:eastAsia="Noto Sans CJK KR"/>
+                <w:b w:val="0"/>
+                <w:sz w:val="17"/>
+              </w:rPr>
+              <w:t>DISPENSE INVALID_FORMAT</w:t>
+            </w:r>
+          </w:p>
+        </w:tc>
+        <w:tc>
+          <w:tcPr>
+            <w:tcW w:type="dxa" w:w="3400"/>
+            <w:vAlign w:val="center"/>
+            <w:shd w:fill="EAF4FA"/>
+          </w:tcPr>
+          <w:p>
+            <w:pPr>
+              <w:spacing w:after="0"/>
+            </w:pPr>
+            <w:r>
+              <w:rPr>
+                <w:rFonts w:ascii="Noto Sans CJK KR" w:hAnsi="Noto Sans CJK KR" w:eastAsia="Noto Sans CJK KR"/>
+                <w:b w:val="0"/>
+                <w:sz w:val="17"/>
+              </w:rPr>
+              <w:t>Pi의 같은 DISPENSE 재전송, 서보 중복 구동 없음</w:t>
+            </w:r>
+          </w:p>
+        </w:tc>
+      </w:tr>
     </w:tbl>
     <w:p>
       <w:pPr>
@@ -5658,6 +7208,149 @@
           <w:sz w:val="17"/>
         </w:rPr>
         <w:t>Pi &gt; ACK|00000002|RESULT</w:t>
+      </w:r>
+    </w:p>
+    <w:p>
+      <w:r>
+        <w:rPr>
+          <w:rFonts w:ascii="Noto Sans CJK KR" w:hAnsi="Noto Sans CJK KR" w:eastAsia="Noto Sans CJK KR"/>
+          <w:b w:val="0"/>
+        </w:rPr>
+        <w:t>사용자가 허용시간 안에 약 배출 버튼을 누르지 않은 경우:</w:t>
+      </w:r>
+    </w:p>
+    <w:p>
+      <w:pPr>
+        <w:spacing w:before="60" w:after="140"/>
+        <w:ind w:left="198" w:right="198"/>
+        <w:shd w:fill="F1F5F9"/>
+      </w:pPr>
+      <w:r>
+        <w:rPr>
+          <w:rFonts w:ascii="D2Coding" w:hAnsi="D2Coding" w:eastAsia="D2Coding"/>
+          <w:color w:val="0F172A"/>
+          <w:sz w:val="17"/>
+        </w:rPr>
+        <w:t>Pi &gt; MOVE|00000001|0|0|003600</w:t>
+      </w:r>
+      <w:r>
+        <w:br/>
+      </w:r>
+      <w:r>
+        <w:rPr>
+          <w:rFonts w:ascii="D2Coding" w:hAnsi="D2Coding" w:eastAsia="D2Coding"/>
+          <w:color w:val="0F172A"/>
+          <w:sz w:val="17"/>
+        </w:rPr>
+        <w:t>AT &lt; ACK|00000001|MOVE</w:t>
+      </w:r>
+      <w:r>
+        <w:br/>
+      </w:r>
+      <w:r>
+        <w:rPr>
+          <w:rFonts w:ascii="D2Coding" w:hAnsi="D2Coding" w:eastAsia="D2Coding"/>
+          <w:color w:val="0F172A"/>
+          <w:sz w:val="17"/>
+        </w:rPr>
+        <w:t>AT &lt; WAIT|00000001</w:t>
+      </w:r>
+      <w:r>
+        <w:br/>
+      </w:r>
+      <w:r>
+        <w:rPr>
+          <w:rFonts w:ascii="D2Coding" w:hAnsi="D2Coding" w:eastAsia="D2Coding"/>
+          <w:color w:val="0F172A"/>
+          <w:sz w:val="17"/>
+        </w:rPr>
+      </w:r>
+      <w:r>
+        <w:br/>
+      </w:r>
+      <w:r>
+        <w:rPr>
+          <w:rFonts w:ascii="D2Coding" w:hAnsi="D2Coding" w:eastAsia="D2Coding"/>
+          <w:color w:val="0F172A"/>
+          <w:sz w:val="17"/>
+        </w:rPr>
+        <w:t># 예약 시각 + 허용시간 도달</w:t>
+      </w:r>
+      <w:r>
+        <w:br/>
+      </w:r>
+      <w:r>
+        <w:rPr>
+          <w:rFonts w:ascii="D2Coding" w:hAnsi="D2Coding" w:eastAsia="D2Coding"/>
+          <w:color w:val="0F172A"/>
+          <w:sz w:val="17"/>
+        </w:rPr>
+        <w:t>Pi &gt; TIMEOUT|00000001</w:t>
+      </w:r>
+      <w:r>
+        <w:br/>
+      </w:r>
+      <w:r>
+        <w:rPr>
+          <w:rFonts w:ascii="D2Coding" w:hAnsi="D2Coding" w:eastAsia="D2Coding"/>
+          <w:color w:val="0F172A"/>
+          <w:sz w:val="17"/>
+        </w:rPr>
+        <w:t>AT: READY 해제, 좌표 00 유지, TIMED_OUT 저장</w:t>
+      </w:r>
+      <w:r>
+        <w:br/>
+      </w:r>
+      <w:r>
+        <w:rPr>
+          <w:rFonts w:ascii="D2Coding" w:hAnsi="D2Coding" w:eastAsia="D2Coding"/>
+          <w:color w:val="0F172A"/>
+          <w:sz w:val="17"/>
+        </w:rPr>
+        <w:t>AT &lt; ACK|00000001|TIMEOUT</w:t>
+      </w:r>
+      <w:r>
+        <w:br/>
+      </w:r>
+      <w:r>
+        <w:rPr>
+          <w:rFonts w:ascii="D2Coding" w:hAnsi="D2Coding" w:eastAsia="D2Coding"/>
+          <w:color w:val="0F172A"/>
+          <w:sz w:val="17"/>
+        </w:rPr>
+      </w:r>
+      <w:r>
+        <w:br/>
+      </w:r>
+      <w:r>
+        <w:rPr>
+          <w:rFonts w:ascii="D2Coding" w:hAnsi="D2Coding" w:eastAsia="D2Coding"/>
+          <w:color w:val="0F172A"/>
+          <w:sz w:val="17"/>
+        </w:rPr>
+        <w:t># ACK가 유실되면 10초 후 같은 프레임</w:t>
+      </w:r>
+      <w:r>
+        <w:br/>
+      </w:r>
+      <w:r>
+        <w:rPr>
+          <w:rFonts w:ascii="D2Coding" w:hAnsi="D2Coding" w:eastAsia="D2Coding"/>
+          <w:color w:val="0F172A"/>
+          <w:sz w:val="17"/>
+        </w:rPr>
+        <w:t>Pi &gt; TIMEOUT|00000001</w:t>
+      </w:r>
+      <w:r>
+        <w:br/>
+      </w:r>
+      <w:r>
+        <w:rPr>
+          <w:rFonts w:ascii="D2Coding" w:hAnsi="D2Coding" w:eastAsia="D2Coding"/>
+          <w:color w:val="0F172A"/>
+          <w:sz w:val="17"/>
+        </w:rPr>
+        <w:t>AT &lt; ACK|00000001|TIMEOUT</w:t>
       </w:r>
     </w:p>
     <w:p>

</xml_diff>

<commit_message>
this is  empty pill, uart add : R2
</commit_message>
<xml_diff>
--- a/raspberry_pi/s_w/slotguard/docs/ATmega128A_UART_구현명세_v1.0.docx
+++ b/raspberry_pi/s_w/slotguard/docs/ATmega128A_UART_구현명세_v1.0.docx
@@ -39,7 +39,7 @@
           <w:rFonts w:ascii="Noto Sans CJK KR" w:hAnsi="Noto Sans CJK KR" w:eastAsia="Noto Sans CJK KR"/>
           <w:b w:val="0"/>
         </w:rPr>
-        <w:t>문서 버전: v1.0 작성 기준일: 2026-08-13 대상: ATmega128A 펌웨어 개발팀 연동 상대: Raspberry Pi 4 / SLOT-GUARD Flask·UART 서비스</w:t>
+        <w:t>문서 버전: v1.1 작성 기준일: 2026-08-24 대상: ATmega128A 펌웨어 개발팀 연동 상대: Raspberry Pi 4 / SLOT-GUARD Flask·UART 서비스</w:t>
       </w:r>
     </w:p>
     <w:p>
@@ -1238,7 +1238,7 @@
                 <w:b w:val="0"/>
                 <w:sz w:val="17"/>
               </w:rPr>
-              <w:t>예약 기준 복약 허용시간(초)</w:t>
+              <w:t>Pi가 계산한 현재 복약 허용시간(초)</w:t>
             </w:r>
           </w:p>
         </w:tc>
@@ -1333,6 +1333,45 @@
           <w:b w:val="0"/>
         </w:rPr>
         <w:t>ACK는 명령 형식과 수행 가능 여부를 확인하고 중복 방지 상태를 저장한 뒤, 스테핑모터를 움직이기 직전에 전송한다. WAIT는 목표 위치 도착과 서보 배출 가능 상태를 의미한다.</w:t>
+      </w:r>
+    </w:p>
+    <w:p>
+      <w:r>
+        <w:rPr>
+          <w:rFonts w:ascii="Noto Sans CJK KR" w:hAnsi="Noto Sans CJK KR" w:eastAsia="Noto Sans CJK KR"/>
+          <w:b w:val="0"/>
+        </w:rPr>
+        <w:t xml:space="preserve">최초 MOVE에는 예약에 설정된 허용시간을 사용한다. 빈 슬롯 결과 </w:t>
+      </w:r>
+      <w:r>
+        <w:rPr>
+          <w:rFonts w:ascii="D2Coding" w:hAnsi="D2Coding" w:eastAsia="D2Coding"/>
+          <w:color w:val="9A3412"/>
+          <w:sz w:val="18"/>
+        </w:rPr>
+        <w:t>XY2</w:t>
+      </w:r>
+      <w:r>
+        <w:rPr>
+          <w:rFonts w:ascii="Noto Sans CJK KR" w:hAnsi="Noto Sans CJK KR" w:eastAsia="Noto Sans CJK KR"/>
+          <w:b w:val="0"/>
+        </w:rPr>
+        <w:t xml:space="preserve"> 후 같은 복약을 다음 슬롯에서 계속할 때와 새 블리스터 교체 후 다시 시작할 때는 Pi가 예약 마감까지 남은 시간을 </w:t>
+      </w:r>
+      <w:r>
+        <w:rPr>
+          <w:rFonts w:ascii="D2Coding" w:hAnsi="D2Coding" w:eastAsia="D2Coding"/>
+          <w:color w:val="9A3412"/>
+          <w:sz w:val="18"/>
+        </w:rPr>
+        <w:t>TTTTTT</w:t>
+      </w:r>
+      <w:r>
+        <w:rPr>
+          <w:rFonts w:ascii="Noto Sans CJK KR" w:hAnsi="Noto Sans CJK KR" w:eastAsia="Noto Sans CJK KR"/>
+          <w:b w:val="0"/>
+        </w:rPr>
+        <w:t>로 보낸다. 새 MOVE는 새 요청번호를 사용하며, 같은 요청번호의 재전송에서는 최초 수신한 전체 페이로드가 유지된다.</w:t>
       </w:r>
     </w:p>
     <w:p>
@@ -1703,6 +1742,48 @@
           </w:p>
         </w:tc>
       </w:tr>
+      <w:tr>
+        <w:tc>
+          <w:tcPr>
+            <w:tcW w:type="dxa" w:w="5100"/>
+            <w:vAlign w:val="center"/>
+            <w:shd w:fill="FFFFFF"/>
+          </w:tcPr>
+          <w:p>
+            <w:pPr>
+              <w:spacing w:after="0"/>
+            </w:pPr>
+            <w:r>
+              <w:rPr>
+                <w:rFonts w:ascii="Noto Sans CJK KR" w:hAnsi="Noto Sans CJK KR" w:eastAsia="Noto Sans CJK KR"/>
+                <w:b w:val="0"/>
+                <w:sz w:val="17"/>
+              </w:rPr>
+              <w:t>R=2</w:t>
+            </w:r>
+          </w:p>
+        </w:tc>
+        <w:tc>
+          <w:tcPr>
+            <w:tcW w:type="dxa" w:w="5100"/>
+            <w:vAlign w:val="center"/>
+            <w:shd w:fill="FFFFFF"/>
+          </w:tcPr>
+          <w:p>
+            <w:pPr>
+              <w:spacing w:after="0"/>
+            </w:pPr>
+            <w:r>
+              <w:rPr>
+                <w:rFonts w:ascii="Noto Sans CJK KR" w:hAnsi="Noto Sans CJK KR" w:eastAsia="Noto Sans CJK KR"/>
+                <w:b w:val="0"/>
+                <w:sz w:val="17"/>
+              </w:rPr>
+              <w:t>압출기는 정상 동작했으나 해당 블리스터 슬롯이 비어 있음</w:t>
+            </w:r>
+          </w:p>
+        </w:tc>
+      </w:tr>
     </w:tbl>
     <w:p>
       <w:pPr>
@@ -1799,6 +1880,46 @@
       </w:r>
     </w:p>
     <w:p>
+      <w:pPr>
+        <w:pStyle w:val="ListBullet"/>
+      </w:pPr>
+      <w:r>
+        <w:rPr>
+          <w:rFonts w:ascii="D2Coding" w:hAnsi="D2Coding" w:eastAsia="D2Coding"/>
+          <w:color w:val="9A3412"/>
+          <w:sz w:val="18"/>
+        </w:rPr>
+        <w:t>RESULT|00000016|102</w:t>
+      </w:r>
+      <w:r>
+        <w:rPr>
+          <w:rFonts w:ascii="Noto Sans CJK KR" w:hAnsi="Noto Sans CJK KR" w:eastAsia="Noto Sans CJK KR"/>
+          <w:b w:val="0"/>
+        </w:rPr>
+        <w:t>: 1행 0열 빈 슬롯</w:t>
+      </w:r>
+    </w:p>
+    <w:p>
+      <w:pPr>
+        <w:pStyle w:val="ListBullet"/>
+      </w:pPr>
+      <w:r>
+        <w:rPr>
+          <w:rFonts w:ascii="D2Coding" w:hAnsi="D2Coding" w:eastAsia="D2Coding"/>
+          <w:color w:val="9A3412"/>
+          <w:sz w:val="18"/>
+        </w:rPr>
+        <w:t>RESULT|00000017|142</w:t>
+      </w:r>
+      <w:r>
+        <w:rPr>
+          <w:rFonts w:ascii="Noto Sans CJK KR" w:hAnsi="Noto Sans CJK KR" w:eastAsia="Noto Sans CJK KR"/>
+          <w:b w:val="0"/>
+        </w:rPr>
+        <w:t>: 1행 4열 빈 슬롯</w:t>
+      </w:r>
+    </w:p>
+    <w:p>
       <w:r>
         <w:rPr>
           <w:rFonts w:ascii="Noto Sans CJK KR" w:hAnsi="Noto Sans CJK KR" w:eastAsia="Noto Sans CJK KR"/>
@@ -1820,6 +1941,23 @@
           <w:b w:val="0"/>
         </w:rPr>
         <w:t>를 기다린다. ACK가 유실되면 RESULT를 재전송할 수 있으며, Pi는 같은 결과를 중복 저장하거나 슬롯을 두 번 이동하지 않는다.</w:t>
+      </w:r>
+    </w:p>
+    <w:p>
+      <w:r>
+        <w:rPr>
+          <w:rFonts w:ascii="D2Coding" w:hAnsi="D2Coding" w:eastAsia="D2Coding"/>
+          <w:color w:val="9A3412"/>
+          <w:sz w:val="18"/>
+        </w:rPr>
+        <w:t>R=2</w:t>
+      </w:r>
+      <w:r>
+        <w:rPr>
+          <w:rFonts w:ascii="Noto Sans CJK KR" w:hAnsi="Noto Sans CJK KR" w:eastAsia="Noto Sans CJK KR"/>
+          <w:b w:val="0"/>
+        </w:rPr>
+        <w:t>의 RESULT ACK 후 Pi는 같은 복약 일정의 다음 좌표로 새 MOVE를 보낼 수 있다. ATmega는 RESULT ACK로 이전 DISPENSE를 종료한 뒤 이 새 요청번호의 MOVE를 정상적인 신규 명령으로 받아야 한다.</w:t>
       </w:r>
     </w:p>
     <w:p>
@@ -2501,7 +2639,7 @@
           <w:color w:val="0F172A"/>
           <w:sz w:val="17"/>
         </w:rPr>
-        <w:t>새 블리스터 및 다음 예약의 새 MOVE → MOVE_ACCEPTED</w:t>
+        <w:t>빈 슬롯의 다음 좌표, 새 블리스터 및 다음 예약의 새 MOVE → MOVE_ACCEPTED</w:t>
       </w:r>
     </w:p>
     <w:tbl>
@@ -3097,7 +3235,7 @@
                 <w:b w:val="0"/>
                 <w:sz w:val="17"/>
               </w:rPr>
-              <w:t>모든 상태</w:t>
+              <w:t>RESULT_ACKED</w:t>
             </w:r>
           </w:p>
         </w:tc>
@@ -3117,6 +3255,68 @@
                 <w:b w:val="0"/>
                 <w:sz w:val="17"/>
               </w:rPr>
+              <w:t>새 요청번호 MOVE</w:t>
+            </w:r>
+          </w:p>
+        </w:tc>
+        <w:tc>
+          <w:tcPr>
+            <w:tcW w:type="dxa" w:w="3400"/>
+            <w:vAlign w:val="center"/>
+            <w:shd w:fill="FFFFFF"/>
+          </w:tcPr>
+          <w:p>
+            <w:pPr>
+              <w:spacing w:after="0"/>
+            </w:pPr>
+            <w:r>
+              <w:rPr>
+                <w:rFonts w:ascii="Noto Sans CJK KR" w:hAnsi="Noto Sans CJK KR" w:eastAsia="Noto Sans CJK KR"/>
+                <w:b w:val="0"/>
+                <w:sz w:val="17"/>
+              </w:rPr>
+              <w:t>EEPROM 저장, 새 좌표 이동 시작</w:t>
+            </w:r>
+          </w:p>
+        </w:tc>
+      </w:tr>
+      <w:tr>
+        <w:tc>
+          <w:tcPr>
+            <w:tcW w:type="dxa" w:w="3400"/>
+            <w:vAlign w:val="center"/>
+            <w:shd w:fill="EAF4FA"/>
+          </w:tcPr>
+          <w:p>
+            <w:pPr>
+              <w:spacing w:after="0"/>
+            </w:pPr>
+            <w:r>
+              <w:rPr>
+                <w:rFonts w:ascii="Noto Sans CJK KR" w:hAnsi="Noto Sans CJK KR" w:eastAsia="Noto Sans CJK KR"/>
+                <w:b w:val="0"/>
+                <w:sz w:val="17"/>
+              </w:rPr>
+              <w:t>모든 상태</w:t>
+            </w:r>
+          </w:p>
+        </w:tc>
+        <w:tc>
+          <w:tcPr>
+            <w:tcW w:type="dxa" w:w="3400"/>
+            <w:vAlign w:val="center"/>
+            <w:shd w:fill="EAF4FA"/>
+          </w:tcPr>
+          <w:p>
+            <w:pPr>
+              <w:spacing w:after="0"/>
+            </w:pPr>
+            <w:r>
+              <w:rPr>
+                <w:rFonts w:ascii="Noto Sans CJK KR" w:hAnsi="Noto Sans CJK KR" w:eastAsia="Noto Sans CJK KR"/>
+                <w:b w:val="0"/>
+                <w:sz w:val="17"/>
+              </w:rPr>
               <w:t>같은 ID+다른 데이터</w:t>
             </w:r>
           </w:p>
@@ -3125,7 +3325,7 @@
           <w:tcPr>
             <w:tcW w:type="dxa" w:w="3400"/>
             <w:vAlign w:val="center"/>
-            <w:shd w:fill="FFFFFF"/>
+            <w:shd w:fill="EAF4FA"/>
           </w:tcPr>
           <w:p>
             <w:pPr>
@@ -3942,6 +4142,18 @@
           <w:b w:val="0"/>
         </w:rPr>
         <w:t>R=0은 센서 미감지이며 ATmega가 자동으로 서보를 다시 작동하지 않는다.</w:t>
+      </w:r>
+    </w:p>
+    <w:p>
+      <w:pPr>
+        <w:pStyle w:val="ListNumber"/>
+      </w:pPr>
+      <w:r>
+        <w:rPr>
+          <w:rFonts w:ascii="Noto Sans CJK KR" w:hAnsi="Noto Sans CJK KR" w:eastAsia="Noto Sans CJK KR"/>
+          <w:b w:val="0"/>
+        </w:rPr>
+        <w:t>R=2는 빈 슬롯 결과이며 ATmega가 다음 슬롯 MOVE나 DISPENSE를 자체 생성하지 않는다.</w:t>
       </w:r>
     </w:p>
     <w:p>
@@ -4928,6 +5140,130 @@
           </w:p>
         </w:tc>
       </w:tr>
+      <w:tr>
+        <w:tc>
+          <w:tcPr>
+            <w:tcW w:type="dxa" w:w="3400"/>
+            <w:vAlign w:val="center"/>
+            <w:shd w:fill="FFFFFF"/>
+          </w:tcPr>
+          <w:p>
+            <w:pPr>
+              <w:spacing w:after="0"/>
+            </w:pPr>
+            <w:r>
+              <w:rPr>
+                <w:rFonts w:ascii="Noto Sans CJK KR" w:hAnsi="Noto Sans CJK KR" w:eastAsia="Noto Sans CJK KR"/>
+                <w:b w:val="0"/>
+                <w:sz w:val="17"/>
+              </w:rPr>
+              <w:t>AT-15</w:t>
+            </w:r>
+          </w:p>
+        </w:tc>
+        <w:tc>
+          <w:tcPr>
+            <w:tcW w:type="dxa" w:w="3400"/>
+            <w:vAlign w:val="center"/>
+            <w:shd w:fill="FFFFFF"/>
+          </w:tcPr>
+          <w:p>
+            <w:pPr>
+              <w:spacing w:after="0"/>
+            </w:pPr>
+            <w:r>
+              <w:rPr>
+                <w:rFonts w:ascii="Noto Sans CJK KR" w:hAnsi="Noto Sans CJK KR" w:eastAsia="Noto Sans CJK KR"/>
+                <w:b w:val="0"/>
+                <w:sz w:val="17"/>
+              </w:rPr>
+              <w:t>빈 블리스터 슬롯</w:t>
+            </w:r>
+          </w:p>
+        </w:tc>
+        <w:tc>
+          <w:tcPr>
+            <w:tcW w:type="dxa" w:w="3400"/>
+            <w:vAlign w:val="center"/>
+            <w:shd w:fill="FFFFFF"/>
+          </w:tcPr>
+          <w:p>
+            <w:pPr>
+              <w:spacing w:after="0"/>
+            </w:pPr>
+            <w:r>
+              <w:rPr>
+                <w:rFonts w:ascii="Noto Sans CJK KR" w:hAnsi="Noto Sans CJK KR" w:eastAsia="Noto Sans CJK KR"/>
+                <w:b w:val="0"/>
+                <w:sz w:val="17"/>
+              </w:rPr>
+              <w:t>정확한 XY2 반환, RESULT ACK 후 새 MOVE 수용</w:t>
+            </w:r>
+          </w:p>
+        </w:tc>
+      </w:tr>
+      <w:tr>
+        <w:tc>
+          <w:tcPr>
+            <w:tcW w:type="dxa" w:w="3400"/>
+            <w:vAlign w:val="center"/>
+            <w:shd w:fill="EAF4FA"/>
+          </w:tcPr>
+          <w:p>
+            <w:pPr>
+              <w:spacing w:after="0"/>
+            </w:pPr>
+            <w:r>
+              <w:rPr>
+                <w:rFonts w:ascii="Noto Sans CJK KR" w:hAnsi="Noto Sans CJK KR" w:eastAsia="Noto Sans CJK KR"/>
+                <w:b w:val="0"/>
+                <w:sz w:val="17"/>
+              </w:rPr>
+              <w:t>AT-16</w:t>
+            </w:r>
+          </w:p>
+        </w:tc>
+        <w:tc>
+          <w:tcPr>
+            <w:tcW w:type="dxa" w:w="3400"/>
+            <w:vAlign w:val="center"/>
+            <w:shd w:fill="EAF4FA"/>
+          </w:tcPr>
+          <w:p>
+            <w:pPr>
+              <w:spacing w:after="0"/>
+            </w:pPr>
+            <w:r>
+              <w:rPr>
+                <w:rFonts w:ascii="Noto Sans CJK KR" w:hAnsi="Noto Sans CJK KR" w:eastAsia="Noto Sans CJK KR"/>
+                <w:b w:val="0"/>
+                <w:sz w:val="17"/>
+              </w:rPr>
+              <w:t>연속 빈 슬롯</w:t>
+            </w:r>
+          </w:p>
+        </w:tc>
+        <w:tc>
+          <w:tcPr>
+            <w:tcW w:type="dxa" w:w="3400"/>
+            <w:vAlign w:val="center"/>
+            <w:shd w:fill="EAF4FA"/>
+          </w:tcPr>
+          <w:p>
+            <w:pPr>
+              <w:spacing w:after="0"/>
+            </w:pPr>
+            <w:r>
+              <w:rPr>
+                <w:rFonts w:ascii="Noto Sans CJK KR" w:hAnsi="Noto Sans CJK KR" w:eastAsia="Noto Sans CJK KR"/>
+                <w:b w:val="0"/>
+                <w:sz w:val="17"/>
+              </w:rPr>
+              <w:t>각 DISPENSE에 XY2 반환, 각 새 MOVE·DISPENSE는 1회만 구동</w:t>
+            </w:r>
+          </w:p>
+        </w:tc>
+      </w:tr>
     </w:tbl>
     <w:p>
       <w:pPr>
@@ -5078,6 +5414,150 @@
           <w:sz w:val="17"/>
         </w:rPr>
         <w:t>Pi &gt; ACK|00000002|RESULT</w:t>
+      </w:r>
+    </w:p>
+    <w:p>
+      <w:r>
+        <w:rPr>
+          <w:rFonts w:ascii="Noto Sans CJK KR" w:hAnsi="Noto Sans CJK KR" w:eastAsia="Noto Sans CJK KR"/>
+          <w:b w:val="0"/>
+        </w:rPr>
+        <w:t>빈 슬롯 후 다음 슬롯으로 이동하는 경우:</w:t>
+      </w:r>
+    </w:p>
+    <w:p>
+      <w:pPr>
+        <w:spacing w:before="60" w:after="140"/>
+        <w:ind w:left="198" w:right="198"/>
+        <w:shd w:fill="F1F5F9"/>
+      </w:pPr>
+      <w:r>
+        <w:rPr>
+          <w:rFonts w:ascii="D2Coding" w:hAnsi="D2Coding" w:eastAsia="D2Coding"/>
+          <w:color w:val="0F172A"/>
+          <w:sz w:val="17"/>
+        </w:rPr>
+        <w:t># 좌표 00이 비어 있고 예약 마감까지 3,540초 남음</w:t>
+      </w:r>
+      <w:r>
+        <w:br/>
+      </w:r>
+      <w:r>
+        <w:rPr>
+          <w:rFonts w:ascii="D2Coding" w:hAnsi="D2Coding" w:eastAsia="D2Coding"/>
+          <w:color w:val="0F172A"/>
+          <w:sz w:val="17"/>
+        </w:rPr>
+        <w:t>AT &lt; RESULT|00000002|002</w:t>
+      </w:r>
+      <w:r>
+        <w:br/>
+      </w:r>
+      <w:r>
+        <w:rPr>
+          <w:rFonts w:ascii="D2Coding" w:hAnsi="D2Coding" w:eastAsia="D2Coding"/>
+          <w:color w:val="0F172A"/>
+          <w:sz w:val="17"/>
+        </w:rPr>
+        <w:t>Pi &gt; ACK|00000002|RESULT</w:t>
+      </w:r>
+      <w:r>
+        <w:br/>
+      </w:r>
+      <w:r>
+        <w:rPr>
+          <w:rFonts w:ascii="D2Coding" w:hAnsi="D2Coding" w:eastAsia="D2Coding"/>
+          <w:color w:val="0F172A"/>
+          <w:sz w:val="17"/>
+        </w:rPr>
+        <w:t>Pi &gt; MOVE|00000003|0|1|003540</w:t>
+      </w:r>
+      <w:r>
+        <w:br/>
+      </w:r>
+      <w:r>
+        <w:rPr>
+          <w:rFonts w:ascii="D2Coding" w:hAnsi="D2Coding" w:eastAsia="D2Coding"/>
+          <w:color w:val="0F172A"/>
+          <w:sz w:val="17"/>
+        </w:rPr>
+        <w:t>AT &lt; ACK|00000003|MOVE</w:t>
+      </w:r>
+      <w:r>
+        <w:br/>
+      </w:r>
+      <w:r>
+        <w:rPr>
+          <w:rFonts w:ascii="D2Coding" w:hAnsi="D2Coding" w:eastAsia="D2Coding"/>
+          <w:color w:val="0F172A"/>
+          <w:sz w:val="17"/>
+        </w:rPr>
+        <w:t>AT &lt; WAIT|00000003</w:t>
+      </w:r>
+      <w:r>
+        <w:br/>
+      </w:r>
+      <w:r>
+        <w:rPr>
+          <w:rFonts w:ascii="D2Coding" w:hAnsi="D2Coding" w:eastAsia="D2Coding"/>
+          <w:color w:val="0F172A"/>
+          <w:sz w:val="17"/>
+        </w:rPr>
+      </w:r>
+      <w:r>
+        <w:br/>
+      </w:r>
+      <w:r>
+        <w:rPr>
+          <w:rFonts w:ascii="D2Coding" w:hAnsi="D2Coding" w:eastAsia="D2Coding"/>
+          <w:color w:val="0F172A"/>
+          <w:sz w:val="17"/>
+        </w:rPr>
+        <w:t># 사용자가 LCD의 약 배출 버튼을 다시 터치</w:t>
+      </w:r>
+      <w:r>
+        <w:br/>
+      </w:r>
+      <w:r>
+        <w:rPr>
+          <w:rFonts w:ascii="D2Coding" w:hAnsi="D2Coding" w:eastAsia="D2Coding"/>
+          <w:color w:val="0F172A"/>
+          <w:sz w:val="17"/>
+        </w:rPr>
+        <w:t>Pi &gt; DISPENSE|00000004|0|1</w:t>
+      </w:r>
+      <w:r>
+        <w:br/>
+      </w:r>
+      <w:r>
+        <w:rPr>
+          <w:rFonts w:ascii="D2Coding" w:hAnsi="D2Coding" w:eastAsia="D2Coding"/>
+          <w:color w:val="0F172A"/>
+          <w:sz w:val="17"/>
+        </w:rPr>
+        <w:t>AT &lt; ACK|00000004|DISPENSE</w:t>
+      </w:r>
+      <w:r>
+        <w:br/>
+      </w:r>
+      <w:r>
+        <w:rPr>
+          <w:rFonts w:ascii="D2Coding" w:hAnsi="D2Coding" w:eastAsia="D2Coding"/>
+          <w:color w:val="0F172A"/>
+          <w:sz w:val="17"/>
+        </w:rPr>
+        <w:t>AT &lt; RESULT|00000004|011</w:t>
+      </w:r>
+      <w:r>
+        <w:br/>
+      </w:r>
+      <w:r>
+        <w:rPr>
+          <w:rFonts w:ascii="D2Coding" w:hAnsi="D2Coding" w:eastAsia="D2Coding"/>
+          <w:color w:val="0F172A"/>
+          <w:sz w:val="17"/>
+        </w:rPr>
+        <w:t>Pi &gt; ACK|00000004|RESULT</w:t>
       </w:r>
     </w:p>
     <w:p>

</xml_diff>